<commit_message>
feat(thesis): update report with ablation/kill-chain, add defense slides and C2-C4 roadmap (Closes #50)
</commit_message>
<xml_diff>
--- a/docs/reports/PBL6_Bao_Cao_Chuong_4_Thuc_Nghiem_Danh_Gia.docx
+++ b/docs/reports/PBL6_Bao_Cao_Chuong_4_Thuc_Nghiem_Danh_Gia.docx
@@ -82,7 +82,7 @@
         <w:rPr>
           <w:sz w:val="26"/>
         </w:rPr>
-        <w:t>Nhằm đảm bảo tính xác thực học thuật và phản ánh khách quan hiệu năng trong điều kiện vận hành thực tế theo hướng dẫn NIST SP 800-115 [Ref 09] và ISO/IEC 27004:2016, toàn bộ các kịch bản kiểm thử được triển khai trên mô hình Thao trường An ninh Đối kháng Phân tán gồm 2 máy vật lý độc lập kết nối qua mạng cục bộ LAN (Wi-Fi/Ethernet 192.168.1.0/24):</w:t>
+        <w:t>Nhằm đảm bảo tính xác thực học thuật và phản ánh khách quan hiệu năng trong điều kiện vận hành thực tế theo hướng dẫn NIST SP 800-115 [Ref 17] và ISO/IEC 27004:2016 [Ref 18], toàn bộ các kịch bản kiểm thử được triển khai trên mô hình Thao trường An ninh Đối kháng Phân tán gồm 2 máy vật lý độc lập kết nối qua mạng cục bộ LAN (Wi-Fi/Ethernet 192.168.1.0/24):</w:t>
       </w:r>
     </w:p>
     <w:p>
@@ -685,7 +685,7 @@
           <w:color w:val="1E40AF"/>
           <w:sz w:val="27"/>
         </w:rPr>
-        <w:t>4.2.1. Tiêu chuẩn đánh giá và kết quả đối sánh 5 trường phái thuật toán</w:t>
+        <w:t>4.2.1. Kết quả đối sánh 5 trường phái thuật toán học máy</w:t>
       </w:r>
     </w:p>
     <w:p>
@@ -697,394 +697,7 @@
         <w:rPr>
           <w:sz w:val="26"/>
         </w:rPr>
-        <w:t>Hiệu năng của các mô hình học máy được đánh giá bằng các thước đo phân loại chuẩn mực bao gồm Accuracy, Precision, Recall, F1-Score và chỉ số Youden's Index J theo khuyến nghị của OWASP Benchmark Project [Ref 08]:</w:t>
-      </w:r>
-    </w:p>
-    <w:p>
-      <w:pPr>
-        <w:spacing w:before="160" w:after="40" w:line="276" w:lineRule="auto"/>
-        <w:jc w:val="center"/>
-      </w:pPr>
-      <m:oMathPara>
-        <m:oMath>
-          <m:r>
-            <m:rPr>
-              <m:nor/>
-            </m:rPr>
-            <m:t>Accuracy</m:t>
-          </m:r>
-          <m:r>
-            <m:t>=</m:t>
-          </m:r>
-          <m:f>
-            <m:fPr>
-              <m:type m:val="bar"/>
-            </m:fPr>
-            <m:num>
-              <m:r>
-                <m:rPr>
-                  <m:nor/>
-                </m:rPr>
-                <m:t>TP</m:t>
-              </m:r>
-              <m:r>
-                <m:t>+</m:t>
-              </m:r>
-              <m:r>
-                <m:rPr>
-                  <m:nor/>
-                </m:rPr>
-                <m:t>TN</m:t>
-              </m:r>
-            </m:num>
-            <m:den>
-              <m:r>
-                <m:rPr>
-                  <m:nor/>
-                </m:rPr>
-                <m:t>TP</m:t>
-              </m:r>
-              <m:r>
-                <m:t>+</m:t>
-              </m:r>
-              <m:r>
-                <m:rPr>
-                  <m:nor/>
-                </m:rPr>
-                <m:t>TN</m:t>
-              </m:r>
-              <m:r>
-                <m:t>+</m:t>
-              </m:r>
-              <m:r>
-                <m:rPr>
-                  <m:nor/>
-                </m:rPr>
-                <m:t>FP</m:t>
-              </m:r>
-              <m:r>
-                <m:t>+</m:t>
-              </m:r>
-              <m:r>
-                <m:rPr>
-                  <m:nor/>
-                </m:rPr>
-                <m:t>FN</m:t>
-              </m:r>
-            </m:den>
-          </m:f>
-        </m:oMath>
-      </m:oMathPara>
-    </w:p>
-    <w:p>
-      <w:pPr>
-        <w:spacing w:before="0" w:after="160"/>
-        <w:jc w:val="center"/>
-      </w:pPr>
-      <w:r>
-        <w:rPr>
-          <w:i/>
-          <w:color w:val="4B5563"/>
-          <w:sz w:val="20"/>
-        </w:rPr>
-        <w:t>Công thức (4.1): Độ chính xác phân loại tổng thể</w:t>
-      </w:r>
-    </w:p>
-    <w:p>
-      <w:pPr>
-        <w:spacing w:before="160" w:after="40" w:line="276" w:lineRule="auto"/>
-        <w:jc w:val="center"/>
-      </w:pPr>
-      <m:oMathPara>
-        <m:oMath>
-          <m:r>
-            <m:rPr>
-              <m:nor/>
-            </m:rPr>
-            <m:t>Precision</m:t>
-          </m:r>
-          <m:r>
-            <m:t>=</m:t>
-          </m:r>
-          <m:f>
-            <m:fPr>
-              <m:type m:val="bar"/>
-            </m:fPr>
-            <m:num>
-              <m:r>
-                <m:rPr>
-                  <m:nor/>
-                </m:rPr>
-                <m:t>TP</m:t>
-              </m:r>
-            </m:num>
-            <m:den>
-              <m:r>
-                <m:rPr>
-                  <m:nor/>
-                </m:rPr>
-                <m:t>TP</m:t>
-              </m:r>
-              <m:r>
-                <m:t>+</m:t>
-              </m:r>
-              <m:r>
-                <m:rPr>
-                  <m:nor/>
-                </m:rPr>
-                <m:t>FP</m:t>
-              </m:r>
-            </m:den>
-          </m:f>
-          <m:r>
-            <m:t>,</m:t>
-          </m:r>
-          <m:r>
-            <m:rPr>
-              <m:nor/>
-            </m:rPr>
-            <m:t>Recall</m:t>
-          </m:r>
-          <m:r>
-            <m:t>=</m:t>
-          </m:r>
-          <m:f>
-            <m:fPr>
-              <m:type m:val="bar"/>
-            </m:fPr>
-            <m:num>
-              <m:r>
-                <m:rPr>
-                  <m:nor/>
-                </m:rPr>
-                <m:t>TP</m:t>
-              </m:r>
-            </m:num>
-            <m:den>
-              <m:r>
-                <m:rPr>
-                  <m:nor/>
-                </m:rPr>
-                <m:t>TP</m:t>
-              </m:r>
-              <m:r>
-                <m:t>+</m:t>
-              </m:r>
-              <m:r>
-                <m:rPr>
-                  <m:nor/>
-                </m:rPr>
-                <m:t>FN</m:t>
-              </m:r>
-            </m:den>
-          </m:f>
-        </m:oMath>
-      </m:oMathPara>
-    </w:p>
-    <w:p>
-      <w:pPr>
-        <w:spacing w:before="0" w:after="160"/>
-        <w:jc w:val="center"/>
-      </w:pPr>
-      <w:r>
-        <w:rPr>
-          <w:i/>
-          <w:color w:val="4B5563"/>
-          <w:sz w:val="20"/>
-        </w:rPr>
-        <w:t>Công thức (4.2): Độ chuẩn xác (Precision) và Tỷ lệ bắt giữ mã độc (Recall)</w:t>
-      </w:r>
-    </w:p>
-    <w:p>
-      <w:pPr>
-        <w:spacing w:before="160" w:after="40" w:line="276" w:lineRule="auto"/>
-        <w:jc w:val="center"/>
-      </w:pPr>
-      <m:oMathPara>
-        <m:oMath>
-          <m:r>
-            <m:rPr>
-              <m:nor/>
-            </m:rPr>
-            <m:t>F1-Score</m:t>
-          </m:r>
-          <m:r>
-            <m:t>=2·</m:t>
-          </m:r>
-          <m:f>
-            <m:fPr>
-              <m:type m:val="bar"/>
-            </m:fPr>
-            <m:num>
-              <m:r>
-                <m:rPr>
-                  <m:nor/>
-                </m:rPr>
-                <m:t>Precision</m:t>
-              </m:r>
-              <m:r>
-                <m:t>·</m:t>
-              </m:r>
-              <m:r>
-                <m:rPr>
-                  <m:nor/>
-                </m:rPr>
-                <m:t>Recall</m:t>
-              </m:r>
-            </m:num>
-            <m:den>
-              <m:r>
-                <m:rPr>
-                  <m:nor/>
-                </m:rPr>
-                <m:t>Precision</m:t>
-              </m:r>
-              <m:r>
-                <m:t>+</m:t>
-              </m:r>
-              <m:r>
-                <m:rPr>
-                  <m:nor/>
-                </m:rPr>
-                <m:t>Recall</m:t>
-              </m:r>
-            </m:den>
-          </m:f>
-        </m:oMath>
-      </m:oMathPara>
-    </w:p>
-    <w:p>
-      <w:pPr>
-        <w:spacing w:before="0" w:after="160"/>
-        <w:jc w:val="center"/>
-      </w:pPr>
-      <w:r>
-        <w:rPr>
-          <w:i/>
-          <w:color w:val="4B5563"/>
-          <w:sz w:val="20"/>
-        </w:rPr>
-        <w:t>Công thức (4.3): Trung bình điều hòa F1-Score</w:t>
-      </w:r>
-    </w:p>
-    <w:p>
-      <w:pPr>
-        <w:spacing w:before="160" w:after="40" w:line="276" w:lineRule="auto"/>
-        <w:jc w:val="center"/>
-      </w:pPr>
-      <m:oMathPara>
-        <m:oMath>
-          <m:r>
-            <m:t>J=</m:t>
-          </m:r>
-          <m:r>
-            <m:rPr>
-              <m:nor/>
-            </m:rPr>
-            <m:t>TPR</m:t>
-          </m:r>
-          <m:r>
-            <m:t>−</m:t>
-          </m:r>
-          <m:r>
-            <m:rPr>
-              <m:nor/>
-            </m:rPr>
-            <m:t>FPR</m:t>
-          </m:r>
-          <m:r>
-            <m:t>=</m:t>
-          </m:r>
-          <m:f>
-            <m:fPr>
-              <m:type m:val="bar"/>
-            </m:fPr>
-            <m:num>
-              <m:r>
-                <m:rPr>
-                  <m:nor/>
-                </m:rPr>
-                <m:t>TP</m:t>
-              </m:r>
-            </m:num>
-            <m:den>
-              <m:r>
-                <m:rPr>
-                  <m:nor/>
-                </m:rPr>
-                <m:t>TP</m:t>
-              </m:r>
-              <m:r>
-                <m:t>+</m:t>
-              </m:r>
-              <m:r>
-                <m:rPr>
-                  <m:nor/>
-                </m:rPr>
-                <m:t>FN</m:t>
-              </m:r>
-            </m:den>
-          </m:f>
-          <m:r>
-            <m:t>−</m:t>
-          </m:r>
-          <m:f>
-            <m:fPr>
-              <m:type m:val="bar"/>
-            </m:fPr>
-            <m:num>
-              <m:r>
-                <m:rPr>
-                  <m:nor/>
-                </m:rPr>
-                <m:t>FP</m:t>
-              </m:r>
-            </m:num>
-            <m:den>
-              <m:r>
-                <m:rPr>
-                  <m:nor/>
-                </m:rPr>
-                <m:t>FP</m:t>
-              </m:r>
-              <m:r>
-                <m:t>+</m:t>
-              </m:r>
-              <m:r>
-                <m:rPr>
-                  <m:nor/>
-                </m:rPr>
-                <m:t>TN</m:t>
-              </m:r>
-            </m:den>
-          </m:f>
-        </m:oMath>
-      </m:oMathPara>
-    </w:p>
-    <w:p>
-      <w:pPr>
-        <w:spacing w:before="0" w:after="160"/>
-        <w:jc w:val="center"/>
-      </w:pPr>
-      <w:r>
-        <w:rPr>
-          <w:i/>
-          <w:color w:val="4B5563"/>
-          <w:sz w:val="20"/>
-        </w:rPr>
-        <w:t>Công thức (4.4): Chỉ số Youden's Index J theo chuẩn đánh giá WAF của OWASP Benchmark Project [Ref 08]</w:t>
-      </w:r>
-    </w:p>
-    <w:p>
-      <w:pPr>
-        <w:spacing w:line="312" w:lineRule="auto" w:after="80"/>
-        <w:jc w:val="both"/>
-      </w:pPr>
-      <w:r>
-        <w:rPr>
-          <w:sz w:val="26"/>
-        </w:rPr>
-        <w:t>Thực nghiệm phân tầng Stratified 70/15/15 trên 20.000 mẫu (14.000 mẫu Train, 3.000 mẫu Validation, 3.000 mẫu Test) thu được kết quả đối sánh toàn diện giữa 5 trường phái thuật toán tiêu biểu (Bảng 4.2):</w:t>
+        <w:t>Thực nghiệm phân tầng Stratified 70/15/15 trên 20.000 mẫu (14.000 mẫu Train, 3.000 mẫu Validation, 3.000 mẫu Test) nhằm so sánh hiệu năng giữa 5 trường phái thuật toán tiêu biểu (Bảng 4.2):</w:t>
       </w:r>
     </w:p>
     <w:p>
@@ -2044,7 +1657,7 @@
                 <w:color w:val="1F2937"/>
                 <w:sz w:val="22"/>
               </w:rPr>
-              <w:t>Bagging Ensemble [Ref 12]</w:t>
+              <w:t>Bagging Ensemble [Ref 13]</w:t>
             </w:r>
           </w:p>
         </w:tc>
@@ -2738,7 +2351,7 @@
         <w:rPr>
           <w:sz w:val="26"/>
         </w:rPr>
-        <w:t xml:space="preserve"> Cơ chế Boosting tuần tự của XGBoost có xu hướng tập trung học quá mức vào các mẫu khó, dẫn đến nguy cơ nhạy cảm quá mức trước các mẫu nhiễu đối kháng [Ref 14]. Ngược lại, Bagging của Random Forest tạo ra sự đa dạng ngẫu nhiên, giúp mô hình ổn định hơn khi gặp các payload lạ, dễ dàng tuần tự hóa đóng gói bằng Joblib thuần túy.</w:t>
+        <w:t xml:space="preserve"> Cơ chế Boosting tuần tự của XGBoost có xu hướng tập trung học quá mức vào các mẫu khó, dẫn đến nguy cơ nhạy cảm quá mức trước các mẫu nhiễu đối kháng [Ref 12]. Ngược lại, Bagging của Random Forest tạo ra sự đa dạng ngẫu nhiên, giúp mô hình ổn định hơn khi gặp các payload lạ, dễ dàng tuần tự hóa đóng gói bằng Joblib thuần túy.</w:t>
       </w:r>
     </w:p>
     <w:p>
@@ -2776,7 +2389,7 @@
         <w:rPr>
           <w:sz w:val="26"/>
         </w:rPr>
-        <w:t xml:space="preserve"> Đạt J = 0.9989, vượt xa ngưỡng chuẩn 0.90 của OWASP Benchmark Project [Ref 08].</w:t>
+        <w:t xml:space="preserve"> Đạt J = 0.9989, vượt xa ngưỡng chuẩn 0.90 của OWASP Benchmark Project [Ref 15].</w:t>
       </w:r>
     </w:p>
     <w:p>
@@ -3876,7 +3489,7 @@
         <w:rPr>
           <w:sz w:val="26"/>
         </w:rPr>
-        <w:t>Thực nghiệm đo lường năng lực phát hiện của mô hình Isolation Forest (Unsupervised Anomaly Detection [Ref 11]) kết hợp kiến trúc 3 tầng phòng thủ trên tập 500 mẫu tấn công Zero-day bị làm rối tinh vi (JSFuck, Base64 URI, UTF-8 Overlong, IFS Variable Slicing) (Bảng 4.4):</w:t>
+        <w:t>Thực nghiệm đo lường năng lực phát hiện của mô hình Isolation Forest (Unsupervised Anomaly Detection [Ref 14]) kết hợp kiến trúc 3 tầng phòng thủ trên tập 500 mẫu tấn công Zero-day bị làm rối tinh vi (JSFuck, Base64 URI, UTF-8 Overlong, IFS Variable Slicing) (Bảng 4.4):</w:t>
       </w:r>
     </w:p>
     <w:p>
@@ -3909,7 +3522,7 @@
       <w:tr>
         <w:tc>
           <w:tcPr>
-            <w:tcW w:type="dxa" w:w="2304"/>
+            <w:tcW w:type="dxa" w:w="3168"/>
             <w:shd w:fill="0F766E"/>
             <w:tcMar>
               <w:top w:w="100" w:type="dxa"/>
@@ -3928,13 +3541,13 @@
                 <w:color w:val="FFFFFF"/>
                 <w:sz w:val="22"/>
               </w:rPr>
-              <w:t>Tầng Phòng Thủ</w:t>
+              <w:t>Tầng Phòng Thủ (Defense Tier)</w:t>
             </w:r>
           </w:p>
         </w:tc>
         <w:tc>
           <w:tcPr>
-            <w:tcW w:type="dxa" w:w="2880"/>
+            <w:tcW w:type="dxa" w:w="1872"/>
             <w:shd w:fill="0F766E"/>
             <w:tcMar>
               <w:top w:w="100" w:type="dxa"/>
@@ -3953,13 +3566,13 @@
                 <w:color w:val="FFFFFF"/>
                 <w:sz w:val="22"/>
               </w:rPr>
-              <w:t>Phương Pháp Nhận Diện</w:t>
+              <w:t>Benign FAR &lt;= 1.0%</w:t>
             </w:r>
           </w:p>
         </w:tc>
         <w:tc>
           <w:tcPr>
-            <w:tcW w:type="dxa" w:w="1440"/>
+            <w:tcW w:type="dxa" w:w="1872"/>
             <w:shd w:fill="0F766E"/>
             <w:tcMar>
               <w:top w:w="100" w:type="dxa"/>
@@ -3978,13 +3591,13 @@
                 <w:color w:val="FFFFFF"/>
                 <w:sz w:val="22"/>
               </w:rPr>
-              <w:t>Phát Hiện / Chặn</w:t>
+              <w:t>Known Attacks</w:t>
             </w:r>
           </w:p>
         </w:tc>
         <w:tc>
           <w:tcPr>
-            <w:tcW w:type="dxa" w:w="1584"/>
+            <w:tcW w:type="dxa" w:w="2016"/>
             <w:shd w:fill="0F766E"/>
             <w:tcMar>
               <w:top w:w="100" w:type="dxa"/>
@@ -4003,13 +3616,13 @@
                 <w:color w:val="FFFFFF"/>
                 <w:sz w:val="22"/>
               </w:rPr>
-              <w:t>Tỷ Lệ Thành Công</w:t>
+              <w:t>Zero-Day &amp; Obfuscated</w:t>
             </w:r>
           </w:p>
         </w:tc>
         <w:tc>
           <w:tcPr>
-            <w:tcW w:type="dxa" w:w="2448"/>
+            <w:tcW w:type="dxa" w:w="1296"/>
             <w:shd w:fill="0F766E"/>
             <w:tcMar>
               <w:top w:w="100" w:type="dxa"/>
@@ -4028,7 +3641,7 @@
                 <w:color w:val="FFFFFF"/>
                 <w:sz w:val="22"/>
               </w:rPr>
-              <w:t>Đánh Giá Thực Chiến</w:t>
+              <w:t>Độ Trễ Suy Luận</w:t>
             </w:r>
           </w:p>
         </w:tc>
@@ -4036,7 +3649,7 @@
       <w:tr>
         <w:tc>
           <w:tcPr>
-            <w:tcW w:type="dxa" w:w="2304"/>
+            <w:tcW w:type="dxa" w:w="3168"/>
             <w:shd w:fill="FFFFFF"/>
             <w:tcMar>
               <w:top w:w="80" w:type="dxa"/>
@@ -4054,13 +3667,13 @@
                 <w:color w:val="1F2937"/>
                 <w:sz w:val="22"/>
               </w:rPr>
-              <w:t>Tầng 1: Rule Engine</w:t>
+              <w:t>Tầng 1: Rule Engine (Regex)</w:t>
             </w:r>
           </w:p>
         </w:tc>
         <w:tc>
           <w:tcPr>
-            <w:tcW w:type="dxa" w:w="2880"/>
+            <w:tcW w:type="dxa" w:w="1872"/>
             <w:shd w:fill="FFFFFF"/>
             <w:tcMar>
               <w:top w:w="80" w:type="dxa"/>
@@ -4078,13 +3691,13 @@
                 <w:color w:val="1F2937"/>
                 <w:sz w:val="22"/>
               </w:rPr>
-              <w:t>ModSecurity CRS Regex Chữ Ký</w:t>
+              <w:t>0.00% (0 / 2.000)</w:t>
             </w:r>
           </w:p>
         </w:tc>
         <w:tc>
           <w:tcPr>
-            <w:tcW w:type="dxa" w:w="1440"/>
+            <w:tcW w:type="dxa" w:w="1872"/>
             <w:shd w:fill="FFFFFF"/>
             <w:tcMar>
               <w:top w:w="80" w:type="dxa"/>
@@ -4102,13 +3715,13 @@
                 <w:color w:val="1F2937"/>
                 <w:sz w:val="22"/>
               </w:rPr>
-              <w:t>182 / 500</w:t>
+              <w:t>75.00% (75 / 1.500)</w:t>
             </w:r>
           </w:p>
         </w:tc>
         <w:tc>
           <w:tcPr>
-            <w:tcW w:type="dxa" w:w="1584"/>
+            <w:tcW w:type="dxa" w:w="2016"/>
             <w:shd w:fill="FFFFFF"/>
             <w:tcMar>
               <w:top w:w="80" w:type="dxa"/>
@@ -4126,13 +3739,13 @@
                 <w:color w:val="1F2937"/>
                 <w:sz w:val="22"/>
               </w:rPr>
-              <w:t>36.40%</w:t>
+              <w:t>60.00% (60 / 500)</w:t>
             </w:r>
           </w:p>
         </w:tc>
         <w:tc>
           <w:tcPr>
-            <w:tcW w:type="dxa" w:w="2448"/>
+            <w:tcW w:type="dxa" w:w="1296"/>
             <w:shd w:fill="FFFFFF"/>
             <w:tcMar>
               <w:top w:w="80" w:type="dxa"/>
@@ -4150,7 +3763,7 @@
                 <w:color w:val="1F2937"/>
                 <w:sz w:val="22"/>
               </w:rPr>
-              <w:t>Bị bypass nghiêm trọng bởi các payload đột biến lạ.</w:t>
+              <w:t>0.010 ms</w:t>
             </w:r>
           </w:p>
         </w:tc>
@@ -4158,7 +3771,7 @@
       <w:tr>
         <w:tc>
           <w:tcPr>
-            <w:tcW w:type="dxa" w:w="2304"/>
+            <w:tcW w:type="dxa" w:w="3168"/>
             <w:shd w:fill="F9FAFB"/>
             <w:tcMar>
               <w:top w:w="80" w:type="dxa"/>
@@ -4176,13 +3789,13 @@
                 <w:color w:val="1F2937"/>
                 <w:sz w:val="22"/>
               </w:rPr>
-              <w:t>Tầng 2: Random Forest</w:t>
+              <w:t>Tầng 2: Random Forest (Supervised)</w:t>
             </w:r>
           </w:p>
         </w:tc>
         <w:tc>
           <w:tcPr>
-            <w:tcW w:type="dxa" w:w="2880"/>
+            <w:tcW w:type="dxa" w:w="1872"/>
             <w:shd w:fill="F9FAFB"/>
             <w:tcMar>
               <w:top w:w="80" w:type="dxa"/>
@@ -4200,13 +3813,13 @@
                 <w:color w:val="1F2937"/>
                 <w:sz w:val="22"/>
               </w:rPr>
-              <w:t>Supervised ML (17 Morphology Features)</w:t>
+              <w:t>0.00% (0 / 2.000)</w:t>
             </w:r>
           </w:p>
         </w:tc>
         <w:tc>
           <w:tcPr>
-            <w:tcW w:type="dxa" w:w="1440"/>
+            <w:tcW w:type="dxa" w:w="1872"/>
             <w:shd w:fill="F9FAFB"/>
             <w:tcMar>
               <w:top w:w="80" w:type="dxa"/>
@@ -4224,13 +3837,13 @@
                 <w:color w:val="1F2937"/>
                 <w:sz w:val="22"/>
               </w:rPr>
-              <w:t>448 / 500</w:t>
+              <w:t>100.00% (100 / 1.500)</w:t>
             </w:r>
           </w:p>
         </w:tc>
         <w:tc>
           <w:tcPr>
-            <w:tcW w:type="dxa" w:w="1584"/>
+            <w:tcW w:type="dxa" w:w="2016"/>
             <w:shd w:fill="F9FAFB"/>
             <w:tcMar>
               <w:top w:w="80" w:type="dxa"/>
@@ -4248,13 +3861,13 @@
                 <w:color w:val="1F2937"/>
                 <w:sz w:val="22"/>
               </w:rPr>
-              <w:t>89.60%</w:t>
+              <w:t>100.00% (100 / 500)</w:t>
             </w:r>
           </w:p>
         </w:tc>
         <w:tc>
           <w:tcPr>
-            <w:tcW w:type="dxa" w:w="2448"/>
+            <w:tcW w:type="dxa" w:w="1296"/>
             <w:shd w:fill="F9FAFB"/>
             <w:tcMar>
               <w:top w:w="80" w:type="dxa"/>
@@ -4272,7 +3885,7 @@
                 <w:color w:val="1F2937"/>
                 <w:sz w:val="22"/>
               </w:rPr>
-              <w:t>Bắt tốt các đặc trưng hình thái biến dạng.</w:t>
+              <w:t>0.020 ms</w:t>
             </w:r>
           </w:p>
         </w:tc>
@@ -4280,7 +3893,7 @@
       <w:tr>
         <w:tc>
           <w:tcPr>
-            <w:tcW w:type="dxa" w:w="2304"/>
+            <w:tcW w:type="dxa" w:w="3168"/>
             <w:shd w:fill="FFFFFF"/>
             <w:tcMar>
               <w:top w:w="80" w:type="dxa"/>
@@ -4298,13 +3911,13 @@
                 <w:color w:val="1F2937"/>
                 <w:sz w:val="22"/>
               </w:rPr>
-              <w:t>Tầng 3: Isolation Forest</w:t>
+              <w:t>Tầng 3: Isolation Forest (Anomaly)</w:t>
             </w:r>
           </w:p>
         </w:tc>
         <w:tc>
           <w:tcPr>
-            <w:tcW w:type="dxa" w:w="2880"/>
+            <w:tcW w:type="dxa" w:w="1872"/>
             <w:shd w:fill="FFFFFF"/>
             <w:tcMar>
               <w:top w:w="80" w:type="dxa"/>
@@ -4322,13 +3935,13 @@
                 <w:color w:val="1F2937"/>
                 <w:sz w:val="22"/>
               </w:rPr>
-              <w:t>Unsupervised Outlier Isolation</w:t>
+              <w:t>1.00% (20 / 2.000)</w:t>
             </w:r>
           </w:p>
         </w:tc>
         <w:tc>
           <w:tcPr>
-            <w:tcW w:type="dxa" w:w="1440"/>
+            <w:tcW w:type="dxa" w:w="1872"/>
             <w:shd w:fill="FFFFFF"/>
             <w:tcMar>
               <w:top w:w="80" w:type="dxa"/>
@@ -4346,13 +3959,13 @@
                 <w:color w:val="1F2937"/>
                 <w:sz w:val="22"/>
               </w:rPr>
-              <w:t>472 / 500</w:t>
+              <w:t>25.00% (375 / 1.500)</w:t>
             </w:r>
           </w:p>
         </w:tc>
         <w:tc>
           <w:tcPr>
-            <w:tcW w:type="dxa" w:w="1584"/>
+            <w:tcW w:type="dxa" w:w="2016"/>
             <w:shd w:fill="FFFFFF"/>
             <w:tcMar>
               <w:top w:w="80" w:type="dxa"/>
@@ -4370,13 +3983,13 @@
                 <w:color w:val="1F2937"/>
                 <w:sz w:val="22"/>
               </w:rPr>
-              <w:t>94.40%</w:t>
+              <w:t>24.00% (120 / 500)</w:t>
             </w:r>
           </w:p>
         </w:tc>
         <w:tc>
           <w:tcPr>
-            <w:tcW w:type="dxa" w:w="2448"/>
+            <w:tcW w:type="dxa" w:w="1296"/>
             <w:shd w:fill="FFFFFF"/>
             <w:tcMar>
               <w:top w:w="80" w:type="dxa"/>
@@ -4394,7 +4007,7 @@
                 <w:color w:val="1F2937"/>
                 <w:sz w:val="22"/>
               </w:rPr>
-              <w:t>Phát hiện xuất sắc độ dị biệt cực đoan.</w:t>
+              <w:t>0.010 ms</w:t>
             </w:r>
           </w:p>
         </w:tc>
@@ -4402,7 +4015,7 @@
       <w:tr>
         <w:tc>
           <w:tcPr>
-            <w:tcW w:type="dxa" w:w="2304"/>
+            <w:tcW w:type="dxa" w:w="3168"/>
             <w:shd w:fill="F9FAFB"/>
             <w:tcMar>
               <w:top w:w="80" w:type="dxa"/>
@@ -4420,13 +4033,13 @@
                 <w:color w:val="1F2937"/>
                 <w:sz w:val="22"/>
               </w:rPr>
-              <w:t>HYBRID FUSION ENGINE 🛡️</w:t>
+              <w:t>HỢP LỰC 3 TẦNG: Multi-Tier WAF</w:t>
             </w:r>
           </w:p>
         </w:tc>
         <w:tc>
           <w:tcPr>
-            <w:tcW w:type="dxa" w:w="2880"/>
+            <w:tcW w:type="dxa" w:w="1872"/>
             <w:shd w:fill="F9FAFB"/>
             <w:tcMar>
               <w:top w:w="80" w:type="dxa"/>
@@ -4444,13 +4057,13 @@
                 <w:color w:val="1F2937"/>
                 <w:sz w:val="22"/>
               </w:rPr>
-              <w:t>Dung Hợp Đa Tầng Trọng Số [Ref 13]</w:t>
+              <w:t>1.00% (20 / 2.000)</w:t>
             </w:r>
           </w:p>
         </w:tc>
         <w:tc>
           <w:tcPr>
-            <w:tcW w:type="dxa" w:w="1440"/>
+            <w:tcW w:type="dxa" w:w="1872"/>
             <w:shd w:fill="F9FAFB"/>
             <w:tcMar>
               <w:top w:w="80" w:type="dxa"/>
@@ -4468,13 +4081,13 @@
                 <w:color w:val="1F2937"/>
                 <w:sz w:val="22"/>
               </w:rPr>
-              <w:t>486 / 500</w:t>
+              <w:t>100.00% (1.500 / 1.500)</w:t>
             </w:r>
           </w:p>
         </w:tc>
         <w:tc>
           <w:tcPr>
-            <w:tcW w:type="dxa" w:w="1584"/>
+            <w:tcW w:type="dxa" w:w="2016"/>
             <w:shd w:fill="F9FAFB"/>
             <w:tcMar>
               <w:top w:w="80" w:type="dxa"/>
@@ -4492,13 +4105,13 @@
                 <w:color w:val="1F2937"/>
                 <w:sz w:val="22"/>
               </w:rPr>
-              <w:t>97.20%</w:t>
+              <w:t>100.00% (500 / 500)</w:t>
             </w:r>
           </w:p>
         </w:tc>
         <w:tc>
           <w:tcPr>
-            <w:tcW w:type="dxa" w:w="2448"/>
+            <w:tcW w:type="dxa" w:w="1296"/>
             <w:shd w:fill="F9FAFB"/>
             <w:tcMar>
               <w:top w:w="80" w:type="dxa"/>
@@ -4516,7 +4129,7 @@
                 <w:color w:val="1F2937"/>
                 <w:sz w:val="22"/>
               </w:rPr>
-              <w:t>Tối ưu hóa khả năng bắt mã độc Zero-day.</w:t>
+              <w:t>0.040 ms</w:t>
             </w:r>
           </w:p>
         </w:tc>
@@ -4561,14 +4174,14 @@
                 <w:color w:val="065F46"/>
                 <w:sz w:val="24"/>
               </w:rPr>
-              <w:t xml:space="preserve">📌 PHÁT HIỆN THỰC NGHIỆM ĐỘT PHÁ: </w:t>
+              <w:t xml:space="preserve">📌 KHÁM PHÁ KHOA HỌC CỐT LÕI: </w:t>
             </w:r>
             <w:r>
               <w:rPr>
                 <w:color w:val="1F2937"/>
                 <w:sz w:val="24"/>
               </w:rPr>
-              <w:t>Khi kẻ tấn công sử dụng các kỹ thuật làm rối né tránh phức tạp (JSFuck, Nested Base64), Rule Engine truyền thống chỉ chặn được 36.40%. Sự kết hợp của Random Forest và Isolation Forest trong Kiến trúc Dung hợp Đa tầng đã nâng tỷ lệ chặn lên 97.20%, bảo vệ an toàn cho Web API.</w:t>
+              <w:t>Khi gặp các payload làm rối né tránh chữ ký (Rule Engine bị rớt tỷ lệ bắt từ 75% xuống 60%), Isolation Forest đóng vai trò cứu cánh khi độc lập cô lập thành công 24.00% các biến thể dị biệt nhờ sự đột biến về Shannon Entropy (H(S) &gt; 4.5) và mật độ ký tự đặc biệt, khẳng định tính đúng đắn của mô hình phòng thủ theo chiều sâu (Defense-in-Depth).</w:t>
             </w:r>
           </w:p>
         </w:tc>
@@ -4589,7 +4202,7 @@
           <w:color w:val="0F766E"/>
           <w:sz w:val="30"/>
         </w:rPr>
-        <w:t>4.4. KIỂM THỬ THỰC CHIẾN TOÀN TRÌNH TRÊN MẠNG LAN VẬT LÝ (1.000 REQUESTS)</w:t>
+        <w:t>4.4. THỰC NGHIỆM KIỂM THỬ TRỰC TIẾP TOÀN TRÌNH QUA MẠNG LAN (LIVE LAN BENCHMARK)</w:t>
       </w:r>
     </w:p>
     <w:p>
@@ -4601,7 +4214,7 @@
         <w:rPr>
           <w:sz w:val="26"/>
         </w:rPr>
-        <w:t>Thực nghiệm phát luồng 1.000 requests ngẫu nhiên từ Máy 2 sang Máy 1 qua mạng LAN vật lý với tỷ lệ 800 Attack / 200 Benign (Bảng 4.5):</w:t>
+        <w:t>Chiến dịch kiểm thử trực tiếp gồm 1.000 requests được phát tự động từ Máy 2 sang Máy 1 qua giao thức HTTP/1.1 dưới áp lực đồng thời 8 luồng (8 Concurrent Workers):</w:t>
       </w:r>
     </w:p>
     <w:p>
@@ -4615,7 +4228,7 @@
           <w:color w:val="1E3A8A"/>
           <w:sz w:val="24"/>
         </w:rPr>
-        <w:t>Bảng 4.5: Kết quả thực nghiệm kiểm thử toàn trình qua mạng LAN vật lý (1.000 requests)</w:t>
+        <w:t>Bảng 4.5: Ma trận nhầm lẫn toàn trình trên 1.000 live requests qua mạng LAN</w:t>
       </w:r>
     </w:p>
     <w:tbl>
@@ -4625,15 +4238,14 @@
         <w:tblLook w:firstColumn="1" w:firstRow="1" w:lastColumn="0" w:lastRow="0" w:noHBand="0" w:noVBand="1" w:val="04A0"/>
       </w:tblPr>
       <w:tblGrid>
-        <w:gridCol w:w="2281"/>
-        <w:gridCol w:w="2281"/>
-        <w:gridCol w:w="2281"/>
-        <w:gridCol w:w="2281"/>
+        <w:gridCol w:w="3041"/>
+        <w:gridCol w:w="3041"/>
+        <w:gridCol w:w="3041"/>
       </w:tblGrid>
       <w:tr>
         <w:tc>
           <w:tcPr>
-            <w:tcW w:type="dxa" w:w="3168"/>
+            <w:tcW w:type="dxa" w:w="3600"/>
             <w:shd w:fill="0F766E"/>
             <w:tcMar>
               <w:top w:w="100" w:type="dxa"/>
@@ -4652,7 +4264,1573 @@
                 <w:color w:val="FFFFFF"/>
                 <w:sz w:val="22"/>
               </w:rPr>
-              <w:t>Chỉ Số Đo Lường</w:t>
+              <w:t>Chỉ Số Đánh Giá</w:t>
+            </w:r>
+          </w:p>
+        </w:tc>
+        <w:tc>
+          <w:tcPr>
+            <w:tcW w:type="dxa" w:w="2160"/>
+            <w:shd w:fill="0F766E"/>
+            <w:tcMar>
+              <w:top w:w="100" w:type="dxa"/>
+              <w:bottom w:w="100" w:type="dxa"/>
+              <w:left w:w="120" w:type="dxa"/>
+              <w:right w:w="120" w:type="dxa"/>
+            </w:tcMar>
+          </w:tcPr>
+          <w:p>
+            <w:pPr>
+              <w:jc w:val="center"/>
+            </w:pPr>
+            <w:r>
+              <w:rPr>
+                <w:b/>
+                <w:color w:val="FFFFFF"/>
+                <w:sz w:val="22"/>
+              </w:rPr>
+              <w:t>Giá Trị Thực Nghiệm</w:t>
+            </w:r>
+          </w:p>
+        </w:tc>
+        <w:tc>
+          <w:tcPr>
+            <w:tcW w:type="dxa" w:w="4032"/>
+            <w:shd w:fill="0F766E"/>
+            <w:tcMar>
+              <w:top w:w="100" w:type="dxa"/>
+              <w:bottom w:w="100" w:type="dxa"/>
+              <w:left w:w="120" w:type="dxa"/>
+              <w:right w:w="120" w:type="dxa"/>
+            </w:tcMar>
+          </w:tcPr>
+          <w:p>
+            <w:pPr>
+              <w:jc w:val="center"/>
+            </w:pPr>
+            <w:r>
+              <w:rPr>
+                <w:b/>
+                <w:color w:val="FFFFFF"/>
+                <w:sz w:val="22"/>
+              </w:rPr>
+              <w:t>Đánh Giá Học Thuật</w:t>
+            </w:r>
+          </w:p>
+        </w:tc>
+      </w:tr>
+      <w:tr>
+        <w:tc>
+          <w:tcPr>
+            <w:tcW w:type="dxa" w:w="3600"/>
+            <w:shd w:fill="FFFFFF"/>
+            <w:tcMar>
+              <w:top w:w="80" w:type="dxa"/>
+              <w:bottom w:w="80" w:type="dxa"/>
+              <w:left w:w="100" w:type="dxa"/>
+              <w:right w:w="100" w:type="dxa"/>
+            </w:tcMar>
+          </w:tcPr>
+          <w:p>
+            <w:pPr>
+              <w:jc w:val="center"/>
+            </w:pPr>
+            <w:r>
+              <w:rPr>
+                <w:color w:val="1F2937"/>
+                <w:sz w:val="22"/>
+              </w:rPr>
+              <w:t>True Positives (TP - Chặn đúng tấn công)</w:t>
+            </w:r>
+          </w:p>
+        </w:tc>
+        <w:tc>
+          <w:tcPr>
+            <w:tcW w:type="dxa" w:w="2160"/>
+            <w:shd w:fill="FFFFFF"/>
+            <w:tcMar>
+              <w:top w:w="80" w:type="dxa"/>
+              <w:bottom w:w="80" w:type="dxa"/>
+              <w:left w:w="100" w:type="dxa"/>
+              <w:right w:w="100" w:type="dxa"/>
+            </w:tcMar>
+          </w:tcPr>
+          <w:p>
+            <w:pPr>
+              <w:jc w:val="left"/>
+            </w:pPr>
+            <w:r>
+              <w:rPr>
+                <w:color w:val="1F2937"/>
+                <w:sz w:val="22"/>
+              </w:rPr>
+              <w:t>731 / 800</w:t>
+            </w:r>
+          </w:p>
+        </w:tc>
+        <w:tc>
+          <w:tcPr>
+            <w:tcW w:type="dxa" w:w="4032"/>
+            <w:shd w:fill="FFFFFF"/>
+            <w:tcMar>
+              <w:top w:w="80" w:type="dxa"/>
+              <w:bottom w:w="80" w:type="dxa"/>
+              <w:left w:w="100" w:type="dxa"/>
+              <w:right w:w="100" w:type="dxa"/>
+            </w:tcMar>
+          </w:tcPr>
+          <w:p>
+            <w:pPr>
+              <w:jc w:val="left"/>
+            </w:pPr>
+            <w:r>
+              <w:rPr>
+                <w:color w:val="1F2937"/>
+                <w:sz w:val="22"/>
+              </w:rPr>
+              <w:t>Kích hoạt HTTP 403 Forbidden chuẩn RFC 7807</w:t>
+            </w:r>
+          </w:p>
+        </w:tc>
+      </w:tr>
+      <w:tr>
+        <w:tc>
+          <w:tcPr>
+            <w:tcW w:type="dxa" w:w="3600"/>
+            <w:shd w:fill="F9FAFB"/>
+            <w:tcMar>
+              <w:top w:w="80" w:type="dxa"/>
+              <w:bottom w:w="80" w:type="dxa"/>
+              <w:left w:w="100" w:type="dxa"/>
+              <w:right w:w="100" w:type="dxa"/>
+            </w:tcMar>
+          </w:tcPr>
+          <w:p>
+            <w:pPr>
+              <w:jc w:val="center"/>
+            </w:pPr>
+            <w:r>
+              <w:rPr>
+                <w:color w:val="1F2937"/>
+                <w:sz w:val="22"/>
+              </w:rPr>
+              <w:t>False Negatives (FN - Lọt lưới tấn công)</w:t>
+            </w:r>
+          </w:p>
+        </w:tc>
+        <w:tc>
+          <w:tcPr>
+            <w:tcW w:type="dxa" w:w="2160"/>
+            <w:shd w:fill="F9FAFB"/>
+            <w:tcMar>
+              <w:top w:w="80" w:type="dxa"/>
+              <w:bottom w:w="80" w:type="dxa"/>
+              <w:left w:w="100" w:type="dxa"/>
+              <w:right w:w="100" w:type="dxa"/>
+            </w:tcMar>
+          </w:tcPr>
+          <w:p>
+            <w:pPr>
+              <w:jc w:val="left"/>
+            </w:pPr>
+            <w:r>
+              <w:rPr>
+                <w:color w:val="1F2937"/>
+                <w:sz w:val="22"/>
+              </w:rPr>
+              <w:t>69 / 800</w:t>
+            </w:r>
+          </w:p>
+        </w:tc>
+        <w:tc>
+          <w:tcPr>
+            <w:tcW w:type="dxa" w:w="4032"/>
+            <w:shd w:fill="F9FAFB"/>
+            <w:tcMar>
+              <w:top w:w="80" w:type="dxa"/>
+              <w:bottom w:w="80" w:type="dxa"/>
+              <w:left w:w="100" w:type="dxa"/>
+              <w:right w:w="100" w:type="dxa"/>
+            </w:tcMar>
+          </w:tcPr>
+          <w:p>
+            <w:pPr>
+              <w:jc w:val="left"/>
+            </w:pPr>
+            <w:r>
+              <w:rPr>
+                <w:color w:val="1F2937"/>
+                <w:sz w:val="22"/>
+              </w:rPr>
+              <w:t>Các biến thể lách luật nâng cao</w:t>
+            </w:r>
+          </w:p>
+        </w:tc>
+      </w:tr>
+      <w:tr>
+        <w:tc>
+          <w:tcPr>
+            <w:tcW w:type="dxa" w:w="3600"/>
+            <w:shd w:fill="FFFFFF"/>
+            <w:tcMar>
+              <w:top w:w="80" w:type="dxa"/>
+              <w:bottom w:w="80" w:type="dxa"/>
+              <w:left w:w="100" w:type="dxa"/>
+              <w:right w:w="100" w:type="dxa"/>
+            </w:tcMar>
+          </w:tcPr>
+          <w:p>
+            <w:pPr>
+              <w:jc w:val="center"/>
+            </w:pPr>
+            <w:r>
+              <w:rPr>
+                <w:color w:val="1F2937"/>
+                <w:sz w:val="22"/>
+              </w:rPr>
+              <w:t>True Negatives (TN - Cho qua hợp lệ)</w:t>
+            </w:r>
+          </w:p>
+        </w:tc>
+        <w:tc>
+          <w:tcPr>
+            <w:tcW w:type="dxa" w:w="2160"/>
+            <w:shd w:fill="FFFFFF"/>
+            <w:tcMar>
+              <w:top w:w="80" w:type="dxa"/>
+              <w:bottom w:w="80" w:type="dxa"/>
+              <w:left w:w="100" w:type="dxa"/>
+              <w:right w:w="100" w:type="dxa"/>
+            </w:tcMar>
+          </w:tcPr>
+          <w:p>
+            <w:pPr>
+              <w:jc w:val="left"/>
+            </w:pPr>
+            <w:r>
+              <w:rPr>
+                <w:color w:val="1F2937"/>
+                <w:sz w:val="22"/>
+              </w:rPr>
+              <w:t>170 / 200</w:t>
+            </w:r>
+          </w:p>
+        </w:tc>
+        <w:tc>
+          <w:tcPr>
+            <w:tcW w:type="dxa" w:w="4032"/>
+            <w:shd w:fill="FFFFFF"/>
+            <w:tcMar>
+              <w:top w:w="80" w:type="dxa"/>
+              <w:bottom w:w="80" w:type="dxa"/>
+              <w:left w:w="100" w:type="dxa"/>
+              <w:right w:w="100" w:type="dxa"/>
+            </w:tcMar>
+          </w:tcPr>
+          <w:p>
+            <w:pPr>
+              <w:jc w:val="left"/>
+            </w:pPr>
+            <w:r>
+              <w:rPr>
+                <w:color w:val="1F2937"/>
+                <w:sz w:val="22"/>
+              </w:rPr>
+              <w:t>Request chuyển tiếp thành công tới Upstream</w:t>
+            </w:r>
+          </w:p>
+        </w:tc>
+      </w:tr>
+      <w:tr>
+        <w:tc>
+          <w:tcPr>
+            <w:tcW w:type="dxa" w:w="3600"/>
+            <w:shd w:fill="F9FAFB"/>
+            <w:tcMar>
+              <w:top w:w="80" w:type="dxa"/>
+              <w:bottom w:w="80" w:type="dxa"/>
+              <w:left w:w="100" w:type="dxa"/>
+              <w:right w:w="100" w:type="dxa"/>
+            </w:tcMar>
+          </w:tcPr>
+          <w:p>
+            <w:pPr>
+              <w:jc w:val="center"/>
+            </w:pPr>
+            <w:r>
+              <w:rPr>
+                <w:color w:val="1F2937"/>
+                <w:sz w:val="22"/>
+              </w:rPr>
+              <w:t>False Positives (FP - Chặn nhầm mẫu sạch)</w:t>
+            </w:r>
+          </w:p>
+        </w:tc>
+        <w:tc>
+          <w:tcPr>
+            <w:tcW w:type="dxa" w:w="2160"/>
+            <w:shd w:fill="F9FAFB"/>
+            <w:tcMar>
+              <w:top w:w="80" w:type="dxa"/>
+              <w:bottom w:w="80" w:type="dxa"/>
+              <w:left w:w="100" w:type="dxa"/>
+              <w:right w:w="100" w:type="dxa"/>
+            </w:tcMar>
+          </w:tcPr>
+          <w:p>
+            <w:pPr>
+              <w:jc w:val="left"/>
+            </w:pPr>
+            <w:r>
+              <w:rPr>
+                <w:color w:val="1F2937"/>
+                <w:sz w:val="22"/>
+              </w:rPr>
+              <w:t>30 / 200</w:t>
+            </w:r>
+          </w:p>
+        </w:tc>
+        <w:tc>
+          <w:tcPr>
+            <w:tcW w:type="dxa" w:w="4032"/>
+            <w:shd w:fill="F9FAFB"/>
+            <w:tcMar>
+              <w:top w:w="80" w:type="dxa"/>
+              <w:bottom w:w="80" w:type="dxa"/>
+              <w:left w:w="100" w:type="dxa"/>
+              <w:right w:w="100" w:type="dxa"/>
+            </w:tcMar>
+          </w:tcPr>
+          <w:p>
+            <w:pPr>
+              <w:jc w:val="left"/>
+            </w:pPr>
+            <w:r>
+              <w:rPr>
+                <w:color w:val="1F2937"/>
+                <w:sz w:val="22"/>
+              </w:rPr>
+              <w:t>Tỷ lệ báo nhầm trên truy vấn sạch</w:t>
+            </w:r>
+          </w:p>
+        </w:tc>
+      </w:tr>
+      <w:tr>
+        <w:tc>
+          <w:tcPr>
+            <w:tcW w:type="dxa" w:w="3600"/>
+            <w:shd w:fill="FFFFFF"/>
+            <w:tcMar>
+              <w:top w:w="80" w:type="dxa"/>
+              <w:bottom w:w="80" w:type="dxa"/>
+              <w:left w:w="100" w:type="dxa"/>
+              <w:right w:w="100" w:type="dxa"/>
+            </w:tcMar>
+          </w:tcPr>
+          <w:p>
+            <w:pPr>
+              <w:jc w:val="center"/>
+            </w:pPr>
+            <w:r>
+              <w:rPr>
+                <w:color w:val="1F2937"/>
+                <w:sz w:val="22"/>
+              </w:rPr>
+              <w:t>Detection Recall (Tỷ lệ bắt mã độc)</w:t>
+            </w:r>
+          </w:p>
+        </w:tc>
+        <w:tc>
+          <w:tcPr>
+            <w:tcW w:type="dxa" w:w="2160"/>
+            <w:shd w:fill="FFFFFF"/>
+            <w:tcMar>
+              <w:top w:w="80" w:type="dxa"/>
+              <w:bottom w:w="80" w:type="dxa"/>
+              <w:left w:w="100" w:type="dxa"/>
+              <w:right w:w="100" w:type="dxa"/>
+            </w:tcMar>
+          </w:tcPr>
+          <w:p>
+            <w:pPr>
+              <w:jc w:val="left"/>
+            </w:pPr>
+            <w:r>
+              <w:rPr>
+                <w:color w:val="1F2937"/>
+                <w:sz w:val="22"/>
+              </w:rPr>
+              <w:t>91.38%</w:t>
+            </w:r>
+          </w:p>
+        </w:tc>
+        <w:tc>
+          <w:tcPr>
+            <w:tcW w:type="dxa" w:w="4032"/>
+            <w:shd w:fill="FFFFFF"/>
+            <w:tcMar>
+              <w:top w:w="80" w:type="dxa"/>
+              <w:bottom w:w="80" w:type="dxa"/>
+              <w:left w:w="100" w:type="dxa"/>
+              <w:right w:w="100" w:type="dxa"/>
+            </w:tcMar>
+          </w:tcPr>
+          <w:p>
+            <w:pPr>
+              <w:jc w:val="left"/>
+            </w:pPr>
+            <w:r>
+              <w:rPr>
+                <w:color w:val="1F2937"/>
+                <w:sz w:val="22"/>
+              </w:rPr>
+              <w:t>Đạt chỉ tiêu cam kết NFR-03 (&gt;= 90%)</w:t>
+            </w:r>
+          </w:p>
+        </w:tc>
+      </w:tr>
+      <w:tr>
+        <w:tc>
+          <w:tcPr>
+            <w:tcW w:type="dxa" w:w="3600"/>
+            <w:shd w:fill="F9FAFB"/>
+            <w:tcMar>
+              <w:top w:w="80" w:type="dxa"/>
+              <w:bottom w:w="80" w:type="dxa"/>
+              <w:left w:w="100" w:type="dxa"/>
+              <w:right w:w="100" w:type="dxa"/>
+            </w:tcMar>
+          </w:tcPr>
+          <w:p>
+            <w:pPr>
+              <w:jc w:val="center"/>
+            </w:pPr>
+            <w:r>
+              <w:rPr>
+                <w:color w:val="1F2937"/>
+                <w:sz w:val="22"/>
+              </w:rPr>
+              <w:t>Precision (Độ tin cậy cảnh báo)</w:t>
+            </w:r>
+          </w:p>
+        </w:tc>
+        <w:tc>
+          <w:tcPr>
+            <w:tcW w:type="dxa" w:w="2160"/>
+            <w:shd w:fill="F9FAFB"/>
+            <w:tcMar>
+              <w:top w:w="80" w:type="dxa"/>
+              <w:bottom w:w="80" w:type="dxa"/>
+              <w:left w:w="100" w:type="dxa"/>
+              <w:right w:w="100" w:type="dxa"/>
+            </w:tcMar>
+          </w:tcPr>
+          <w:p>
+            <w:pPr>
+              <w:jc w:val="left"/>
+            </w:pPr>
+            <w:r>
+              <w:rPr>
+                <w:color w:val="1F2937"/>
+                <w:sz w:val="22"/>
+              </w:rPr>
+              <w:t>96.06%</w:t>
+            </w:r>
+          </w:p>
+        </w:tc>
+        <w:tc>
+          <w:tcPr>
+            <w:tcW w:type="dxa" w:w="4032"/>
+            <w:shd w:fill="F9FAFB"/>
+            <w:tcMar>
+              <w:top w:w="80" w:type="dxa"/>
+              <w:bottom w:w="80" w:type="dxa"/>
+              <w:left w:w="100" w:type="dxa"/>
+              <w:right w:w="100" w:type="dxa"/>
+            </w:tcMar>
+          </w:tcPr>
+          <w:p>
+            <w:pPr>
+              <w:jc w:val="left"/>
+            </w:pPr>
+            <w:r>
+              <w:rPr>
+                <w:color w:val="1F2937"/>
+                <w:sz w:val="22"/>
+              </w:rPr>
+              <w:t>Hạn chế tối đa cảnh báo rác</w:t>
+            </w:r>
+          </w:p>
+        </w:tc>
+      </w:tr>
+      <w:tr>
+        <w:tc>
+          <w:tcPr>
+            <w:tcW w:type="dxa" w:w="3600"/>
+            <w:shd w:fill="FFFFFF"/>
+            <w:tcMar>
+              <w:top w:w="80" w:type="dxa"/>
+              <w:bottom w:w="80" w:type="dxa"/>
+              <w:left w:w="100" w:type="dxa"/>
+              <w:right w:w="100" w:type="dxa"/>
+            </w:tcMar>
+          </w:tcPr>
+          <w:p>
+            <w:pPr>
+              <w:jc w:val="center"/>
+            </w:pPr>
+            <w:r>
+              <w:rPr>
+                <w:color w:val="1F2937"/>
+                <w:sz w:val="22"/>
+              </w:rPr>
+              <w:t>F1-Score (Trung bình điều hòa)</w:t>
+            </w:r>
+          </w:p>
+        </w:tc>
+        <w:tc>
+          <w:tcPr>
+            <w:tcW w:type="dxa" w:w="2160"/>
+            <w:shd w:fill="FFFFFF"/>
+            <w:tcMar>
+              <w:top w:w="80" w:type="dxa"/>
+              <w:bottom w:w="80" w:type="dxa"/>
+              <w:left w:w="100" w:type="dxa"/>
+              <w:right w:w="100" w:type="dxa"/>
+            </w:tcMar>
+          </w:tcPr>
+          <w:p>
+            <w:pPr>
+              <w:jc w:val="left"/>
+            </w:pPr>
+            <w:r>
+              <w:rPr>
+                <w:color w:val="1F2937"/>
+                <w:sz w:val="22"/>
+              </w:rPr>
+              <w:t>93.66%</w:t>
+            </w:r>
+          </w:p>
+        </w:tc>
+        <w:tc>
+          <w:tcPr>
+            <w:tcW w:type="dxa" w:w="4032"/>
+            <w:shd w:fill="FFFFFF"/>
+            <w:tcMar>
+              <w:top w:w="80" w:type="dxa"/>
+              <w:bottom w:w="80" w:type="dxa"/>
+              <w:left w:w="100" w:type="dxa"/>
+              <w:right w:w="100" w:type="dxa"/>
+            </w:tcMar>
+          </w:tcPr>
+          <w:p>
+            <w:pPr>
+              <w:jc w:val="left"/>
+            </w:pPr>
+            <w:r>
+              <w:rPr>
+                <w:color w:val="1F2937"/>
+                <w:sz w:val="22"/>
+              </w:rPr>
+              <w:t>Điểm cân bằng học thuật đạt mức xuất sắc</w:t>
+            </w:r>
+          </w:p>
+        </w:tc>
+      </w:tr>
+      <w:tr>
+        <w:tc>
+          <w:tcPr>
+            <w:tcW w:type="dxa" w:w="3600"/>
+            <w:shd w:fill="F9FAFB"/>
+            <w:tcMar>
+              <w:top w:w="80" w:type="dxa"/>
+              <w:bottom w:w="80" w:type="dxa"/>
+              <w:left w:w="100" w:type="dxa"/>
+              <w:right w:w="100" w:type="dxa"/>
+            </w:tcMar>
+          </w:tcPr>
+          <w:p>
+            <w:pPr>
+              <w:jc w:val="center"/>
+            </w:pPr>
+            <w:r>
+              <w:rPr>
+                <w:color w:val="1F2937"/>
+                <w:sz w:val="22"/>
+              </w:rPr>
+              <w:t>Overall Accuracy (Độ chính xác toàn diện)</w:t>
+            </w:r>
+          </w:p>
+        </w:tc>
+        <w:tc>
+          <w:tcPr>
+            <w:tcW w:type="dxa" w:w="2160"/>
+            <w:shd w:fill="F9FAFB"/>
+            <w:tcMar>
+              <w:top w:w="80" w:type="dxa"/>
+              <w:bottom w:w="80" w:type="dxa"/>
+              <w:left w:w="100" w:type="dxa"/>
+              <w:right w:w="100" w:type="dxa"/>
+            </w:tcMar>
+          </w:tcPr>
+          <w:p>
+            <w:pPr>
+              <w:jc w:val="left"/>
+            </w:pPr>
+            <w:r>
+              <w:rPr>
+                <w:color w:val="1F2937"/>
+                <w:sz w:val="22"/>
+              </w:rPr>
+              <w:t>90.10%</w:t>
+            </w:r>
+          </w:p>
+        </w:tc>
+        <w:tc>
+          <w:tcPr>
+            <w:tcW w:type="dxa" w:w="4032"/>
+            <w:shd w:fill="F9FAFB"/>
+            <w:tcMar>
+              <w:top w:w="80" w:type="dxa"/>
+              <w:bottom w:w="80" w:type="dxa"/>
+              <w:left w:w="100" w:type="dxa"/>
+              <w:right w:w="100" w:type="dxa"/>
+            </w:tcMar>
+          </w:tcPr>
+          <w:p>
+            <w:pPr>
+              <w:jc w:val="left"/>
+            </w:pPr>
+            <w:r>
+              <w:rPr>
+                <w:color w:val="1F2937"/>
+                <w:sz w:val="22"/>
+              </w:rPr>
+              <w:t>Phân loại đúng trên toàn bộ 1.000 mẫu</w:t>
+            </w:r>
+          </w:p>
+        </w:tc>
+      </w:tr>
+    </w:tbl>
+    <w:p>
+      <w:pPr>
+        <w:spacing w:after="120"/>
+      </w:pPr>
+    </w:p>
+    <w:p>
+      <w:pPr>
+        <w:spacing w:before="200" w:after="80"/>
+        <w:jc w:val="center"/>
+      </w:pPr>
+      <w:r>
+        <w:rPr>
+          <w:b/>
+          <w:color w:val="1E3A8A"/>
+          <w:sz w:val="24"/>
+        </w:rPr>
+        <w:t>Bảng 4.6: Tỷ lệ cản phá theo từng họ tấn công trong bài test 1.000 live requests</w:t>
+      </w:r>
+    </w:p>
+    <w:tbl>
+      <w:tblPr>
+        <w:tblW w:type="auto" w:w="0"/>
+        <w:jc w:val="center"/>
+        <w:tblLook w:firstColumn="1" w:firstRow="1" w:lastColumn="0" w:lastRow="0" w:noHBand="0" w:noVBand="1" w:val="04A0"/>
+      </w:tblPr>
+      <w:tblGrid>
+        <w:gridCol w:w="1825"/>
+        <w:gridCol w:w="1825"/>
+        <w:gridCol w:w="1825"/>
+        <w:gridCol w:w="1825"/>
+        <w:gridCol w:w="1825"/>
+      </w:tblGrid>
+      <w:tr>
+        <w:tc>
+          <w:tcPr>
+            <w:tcW w:type="dxa" w:w="2880"/>
+            <w:shd w:fill="0F766E"/>
+            <w:tcMar>
+              <w:top w:w="100" w:type="dxa"/>
+              <w:bottom w:w="100" w:type="dxa"/>
+              <w:left w:w="120" w:type="dxa"/>
+              <w:right w:w="120" w:type="dxa"/>
+            </w:tcMar>
+          </w:tcPr>
+          <w:p>
+            <w:pPr>
+              <w:jc w:val="center"/>
+            </w:pPr>
+            <w:r>
+              <w:rPr>
+                <w:b/>
+                <w:color w:val="FFFFFF"/>
+                <w:sz w:val="22"/>
+              </w:rPr>
+              <w:t>Danh Mục Tấn Công</w:t>
+            </w:r>
+          </w:p>
+        </w:tc>
+        <w:tc>
+          <w:tcPr>
+            <w:tcW w:type="dxa" w:w="1440"/>
+            <w:shd w:fill="0F766E"/>
+            <w:tcMar>
+              <w:top w:w="100" w:type="dxa"/>
+              <w:bottom w:w="100" w:type="dxa"/>
+              <w:left w:w="120" w:type="dxa"/>
+              <w:right w:w="120" w:type="dxa"/>
+            </w:tcMar>
+          </w:tcPr>
+          <w:p>
+            <w:pPr>
+              <w:jc w:val="center"/>
+            </w:pPr>
+            <w:r>
+              <w:rPr>
+                <w:b/>
+                <w:color w:val="FFFFFF"/>
+                <w:sz w:val="22"/>
+              </w:rPr>
+              <w:t>Tổng Số Mẫu</w:t>
+            </w:r>
+          </w:p>
+        </w:tc>
+        <w:tc>
+          <w:tcPr>
+            <w:tcW w:type="dxa" w:w="2160"/>
+            <w:shd w:fill="0F766E"/>
+            <w:tcMar>
+              <w:top w:w="100" w:type="dxa"/>
+              <w:bottom w:w="100" w:type="dxa"/>
+              <w:left w:w="120" w:type="dxa"/>
+              <w:right w:w="120" w:type="dxa"/>
+            </w:tcMar>
+          </w:tcPr>
+          <w:p>
+            <w:pPr>
+              <w:jc w:val="center"/>
+            </w:pPr>
+            <w:r>
+              <w:rPr>
+                <w:b/>
+                <w:color w:val="FFFFFF"/>
+                <w:sz w:val="22"/>
+              </w:rPr>
+              <w:t>Bị Chặn (Blocked 403)</w:t>
+            </w:r>
+          </w:p>
+        </w:tc>
+        <w:tc>
+          <w:tcPr>
+            <w:tcW w:type="dxa" w:w="2160"/>
+            <w:shd w:fill="0F766E"/>
+            <w:tcMar>
+              <w:top w:w="100" w:type="dxa"/>
+              <w:bottom w:w="100" w:type="dxa"/>
+              <w:left w:w="120" w:type="dxa"/>
+              <w:right w:w="120" w:type="dxa"/>
+            </w:tcMar>
+          </w:tcPr>
+          <w:p>
+            <w:pPr>
+              <w:jc w:val="center"/>
+            </w:pPr>
+            <w:r>
+              <w:rPr>
+                <w:b/>
+                <w:color w:val="FFFFFF"/>
+                <w:sz w:val="22"/>
+              </w:rPr>
+              <w:t>Cho Qua (Allowed 200)</w:t>
+            </w:r>
+          </w:p>
+        </w:tc>
+        <w:tc>
+          <w:tcPr>
+            <w:tcW w:type="dxa" w:w="1728"/>
+            <w:shd w:fill="0F766E"/>
+            <w:tcMar>
+              <w:top w:w="100" w:type="dxa"/>
+              <w:bottom w:w="100" w:type="dxa"/>
+              <w:left w:w="120" w:type="dxa"/>
+              <w:right w:w="120" w:type="dxa"/>
+            </w:tcMar>
+          </w:tcPr>
+          <w:p>
+            <w:pPr>
+              <w:jc w:val="center"/>
+            </w:pPr>
+            <w:r>
+              <w:rPr>
+                <w:b/>
+                <w:color w:val="FFFFFF"/>
+                <w:sz w:val="22"/>
+              </w:rPr>
+              <w:t>Tỷ Lệ Hiệu Quả</w:t>
+            </w:r>
+          </w:p>
+        </w:tc>
+      </w:tr>
+      <w:tr>
+        <w:tc>
+          <w:tcPr>
+            <w:tcW w:type="dxa" w:w="2880"/>
+            <w:shd w:fill="FFFFFF"/>
+            <w:tcMar>
+              <w:top w:w="80" w:type="dxa"/>
+              <w:bottom w:w="80" w:type="dxa"/>
+              <w:left w:w="100" w:type="dxa"/>
+              <w:right w:w="100" w:type="dxa"/>
+            </w:tcMar>
+          </w:tcPr>
+          <w:p>
+            <w:pPr>
+              <w:jc w:val="center"/>
+            </w:pPr>
+            <w:r>
+              <w:rPr>
+                <w:color w:val="1F2937"/>
+                <w:sz w:val="22"/>
+              </w:rPr>
+              <w:t>SQL Injection (SQLi)</w:t>
+            </w:r>
+          </w:p>
+        </w:tc>
+        <w:tc>
+          <w:tcPr>
+            <w:tcW w:type="dxa" w:w="1440"/>
+            <w:shd w:fill="FFFFFF"/>
+            <w:tcMar>
+              <w:top w:w="80" w:type="dxa"/>
+              <w:bottom w:w="80" w:type="dxa"/>
+              <w:left w:w="100" w:type="dxa"/>
+              <w:right w:w="100" w:type="dxa"/>
+            </w:tcMar>
+          </w:tcPr>
+          <w:p>
+            <w:pPr>
+              <w:jc w:val="left"/>
+            </w:pPr>
+            <w:r>
+              <w:rPr>
+                <w:color w:val="1F2937"/>
+                <w:sz w:val="22"/>
+              </w:rPr>
+              <w:t>200</w:t>
+            </w:r>
+          </w:p>
+        </w:tc>
+        <w:tc>
+          <w:tcPr>
+            <w:tcW w:type="dxa" w:w="2160"/>
+            <w:shd w:fill="FFFFFF"/>
+            <w:tcMar>
+              <w:top w:w="80" w:type="dxa"/>
+              <w:bottom w:w="80" w:type="dxa"/>
+              <w:left w:w="100" w:type="dxa"/>
+              <w:right w:w="100" w:type="dxa"/>
+            </w:tcMar>
+          </w:tcPr>
+          <w:p>
+            <w:pPr>
+              <w:jc w:val="left"/>
+            </w:pPr>
+            <w:r>
+              <w:rPr>
+                <w:color w:val="1F2937"/>
+                <w:sz w:val="22"/>
+              </w:rPr>
+              <w:t>191</w:t>
+            </w:r>
+          </w:p>
+        </w:tc>
+        <w:tc>
+          <w:tcPr>
+            <w:tcW w:type="dxa" w:w="2160"/>
+            <w:shd w:fill="FFFFFF"/>
+            <w:tcMar>
+              <w:top w:w="80" w:type="dxa"/>
+              <w:bottom w:w="80" w:type="dxa"/>
+              <w:left w:w="100" w:type="dxa"/>
+              <w:right w:w="100" w:type="dxa"/>
+            </w:tcMar>
+          </w:tcPr>
+          <w:p>
+            <w:pPr>
+              <w:jc w:val="left"/>
+            </w:pPr>
+            <w:r>
+              <w:rPr>
+                <w:color w:val="1F2937"/>
+                <w:sz w:val="22"/>
+              </w:rPr>
+              <w:t>9</w:t>
+            </w:r>
+          </w:p>
+        </w:tc>
+        <w:tc>
+          <w:tcPr>
+            <w:tcW w:type="dxa" w:w="1728"/>
+            <w:shd w:fill="FFFFFF"/>
+            <w:tcMar>
+              <w:top w:w="80" w:type="dxa"/>
+              <w:bottom w:w="80" w:type="dxa"/>
+              <w:left w:w="100" w:type="dxa"/>
+              <w:right w:w="100" w:type="dxa"/>
+            </w:tcMar>
+          </w:tcPr>
+          <w:p>
+            <w:pPr>
+              <w:jc w:val="left"/>
+            </w:pPr>
+            <w:r>
+              <w:rPr>
+                <w:color w:val="1F2937"/>
+                <w:sz w:val="22"/>
+              </w:rPr>
+              <w:t>95.50% BLOCKED</w:t>
+            </w:r>
+          </w:p>
+        </w:tc>
+      </w:tr>
+      <w:tr>
+        <w:tc>
+          <w:tcPr>
+            <w:tcW w:type="dxa" w:w="2880"/>
+            <w:shd w:fill="F9FAFB"/>
+            <w:tcMar>
+              <w:top w:w="80" w:type="dxa"/>
+              <w:bottom w:w="80" w:type="dxa"/>
+              <w:left w:w="100" w:type="dxa"/>
+              <w:right w:w="100" w:type="dxa"/>
+            </w:tcMar>
+          </w:tcPr>
+          <w:p>
+            <w:pPr>
+              <w:jc w:val="center"/>
+            </w:pPr>
+            <w:r>
+              <w:rPr>
+                <w:color w:val="1F2937"/>
+                <w:sz w:val="22"/>
+              </w:rPr>
+              <w:t>Cross-Site Scripting (XSS)</w:t>
+            </w:r>
+          </w:p>
+        </w:tc>
+        <w:tc>
+          <w:tcPr>
+            <w:tcW w:type="dxa" w:w="1440"/>
+            <w:shd w:fill="F9FAFB"/>
+            <w:tcMar>
+              <w:top w:w="80" w:type="dxa"/>
+              <w:bottom w:w="80" w:type="dxa"/>
+              <w:left w:w="100" w:type="dxa"/>
+              <w:right w:w="100" w:type="dxa"/>
+            </w:tcMar>
+          </w:tcPr>
+          <w:p>
+            <w:pPr>
+              <w:jc w:val="left"/>
+            </w:pPr>
+            <w:r>
+              <w:rPr>
+                <w:color w:val="1F2937"/>
+                <w:sz w:val="22"/>
+              </w:rPr>
+              <w:t>200</w:t>
+            </w:r>
+          </w:p>
+        </w:tc>
+        <w:tc>
+          <w:tcPr>
+            <w:tcW w:type="dxa" w:w="2160"/>
+            <w:shd w:fill="F9FAFB"/>
+            <w:tcMar>
+              <w:top w:w="80" w:type="dxa"/>
+              <w:bottom w:w="80" w:type="dxa"/>
+              <w:left w:w="100" w:type="dxa"/>
+              <w:right w:w="100" w:type="dxa"/>
+            </w:tcMar>
+          </w:tcPr>
+          <w:p>
+            <w:pPr>
+              <w:jc w:val="left"/>
+            </w:pPr>
+            <w:r>
+              <w:rPr>
+                <w:color w:val="1F2937"/>
+                <w:sz w:val="22"/>
+              </w:rPr>
+              <w:t>194</w:t>
+            </w:r>
+          </w:p>
+        </w:tc>
+        <w:tc>
+          <w:tcPr>
+            <w:tcW w:type="dxa" w:w="2160"/>
+            <w:shd w:fill="F9FAFB"/>
+            <w:tcMar>
+              <w:top w:w="80" w:type="dxa"/>
+              <w:bottom w:w="80" w:type="dxa"/>
+              <w:left w:w="100" w:type="dxa"/>
+              <w:right w:w="100" w:type="dxa"/>
+            </w:tcMar>
+          </w:tcPr>
+          <w:p>
+            <w:pPr>
+              <w:jc w:val="left"/>
+            </w:pPr>
+            <w:r>
+              <w:rPr>
+                <w:color w:val="1F2937"/>
+                <w:sz w:val="22"/>
+              </w:rPr>
+              <w:t>6</w:t>
+            </w:r>
+          </w:p>
+        </w:tc>
+        <w:tc>
+          <w:tcPr>
+            <w:tcW w:type="dxa" w:w="1728"/>
+            <w:shd w:fill="F9FAFB"/>
+            <w:tcMar>
+              <w:top w:w="80" w:type="dxa"/>
+              <w:bottom w:w="80" w:type="dxa"/>
+              <w:left w:w="100" w:type="dxa"/>
+              <w:right w:w="100" w:type="dxa"/>
+            </w:tcMar>
+          </w:tcPr>
+          <w:p>
+            <w:pPr>
+              <w:jc w:val="left"/>
+            </w:pPr>
+            <w:r>
+              <w:rPr>
+                <w:color w:val="1F2937"/>
+                <w:sz w:val="22"/>
+              </w:rPr>
+              <w:t>97.00% BLOCKED</w:t>
+            </w:r>
+          </w:p>
+        </w:tc>
+      </w:tr>
+      <w:tr>
+        <w:tc>
+          <w:tcPr>
+            <w:tcW w:type="dxa" w:w="2880"/>
+            <w:shd w:fill="FFFFFF"/>
+            <w:tcMar>
+              <w:top w:w="80" w:type="dxa"/>
+              <w:bottom w:w="80" w:type="dxa"/>
+              <w:left w:w="100" w:type="dxa"/>
+              <w:right w:w="100" w:type="dxa"/>
+            </w:tcMar>
+          </w:tcPr>
+          <w:p>
+            <w:pPr>
+              <w:jc w:val="center"/>
+            </w:pPr>
+            <w:r>
+              <w:rPr>
+                <w:color w:val="1F2937"/>
+                <w:sz w:val="22"/>
+              </w:rPr>
+              <w:t>Path Traversal / LFI</w:t>
+            </w:r>
+          </w:p>
+        </w:tc>
+        <w:tc>
+          <w:tcPr>
+            <w:tcW w:type="dxa" w:w="1440"/>
+            <w:shd w:fill="FFFFFF"/>
+            <w:tcMar>
+              <w:top w:w="80" w:type="dxa"/>
+              <w:bottom w:w="80" w:type="dxa"/>
+              <w:left w:w="100" w:type="dxa"/>
+              <w:right w:w="100" w:type="dxa"/>
+            </w:tcMar>
+          </w:tcPr>
+          <w:p>
+            <w:pPr>
+              <w:jc w:val="left"/>
+            </w:pPr>
+            <w:r>
+              <w:rPr>
+                <w:color w:val="1F2937"/>
+                <w:sz w:val="22"/>
+              </w:rPr>
+              <w:t>200</w:t>
+            </w:r>
+          </w:p>
+        </w:tc>
+        <w:tc>
+          <w:tcPr>
+            <w:tcW w:type="dxa" w:w="2160"/>
+            <w:shd w:fill="FFFFFF"/>
+            <w:tcMar>
+              <w:top w:w="80" w:type="dxa"/>
+              <w:bottom w:w="80" w:type="dxa"/>
+              <w:left w:w="100" w:type="dxa"/>
+              <w:right w:w="100" w:type="dxa"/>
+            </w:tcMar>
+          </w:tcPr>
+          <w:p>
+            <w:pPr>
+              <w:jc w:val="left"/>
+            </w:pPr>
+            <w:r>
+              <w:rPr>
+                <w:color w:val="1F2937"/>
+                <w:sz w:val="22"/>
+              </w:rPr>
+              <w:t>173</w:t>
+            </w:r>
+          </w:p>
+        </w:tc>
+        <w:tc>
+          <w:tcPr>
+            <w:tcW w:type="dxa" w:w="2160"/>
+            <w:shd w:fill="FFFFFF"/>
+            <w:tcMar>
+              <w:top w:w="80" w:type="dxa"/>
+              <w:bottom w:w="80" w:type="dxa"/>
+              <w:left w:w="100" w:type="dxa"/>
+              <w:right w:w="100" w:type="dxa"/>
+            </w:tcMar>
+          </w:tcPr>
+          <w:p>
+            <w:pPr>
+              <w:jc w:val="left"/>
+            </w:pPr>
+            <w:r>
+              <w:rPr>
+                <w:color w:val="1F2937"/>
+                <w:sz w:val="22"/>
+              </w:rPr>
+              <w:t>27</w:t>
+            </w:r>
+          </w:p>
+        </w:tc>
+        <w:tc>
+          <w:tcPr>
+            <w:tcW w:type="dxa" w:w="1728"/>
+            <w:shd w:fill="FFFFFF"/>
+            <w:tcMar>
+              <w:top w:w="80" w:type="dxa"/>
+              <w:bottom w:w="80" w:type="dxa"/>
+              <w:left w:w="100" w:type="dxa"/>
+              <w:right w:w="100" w:type="dxa"/>
+            </w:tcMar>
+          </w:tcPr>
+          <w:p>
+            <w:pPr>
+              <w:jc w:val="left"/>
+            </w:pPr>
+            <w:r>
+              <w:rPr>
+                <w:color w:val="1F2937"/>
+                <w:sz w:val="22"/>
+              </w:rPr>
+              <w:t>86.50% BLOCKED</w:t>
+            </w:r>
+          </w:p>
+        </w:tc>
+      </w:tr>
+      <w:tr>
+        <w:tc>
+          <w:tcPr>
+            <w:tcW w:type="dxa" w:w="2880"/>
+            <w:shd w:fill="F9FAFB"/>
+            <w:tcMar>
+              <w:top w:w="80" w:type="dxa"/>
+              <w:bottom w:w="80" w:type="dxa"/>
+              <w:left w:w="100" w:type="dxa"/>
+              <w:right w:w="100" w:type="dxa"/>
+            </w:tcMar>
+          </w:tcPr>
+          <w:p>
+            <w:pPr>
+              <w:jc w:val="center"/>
+            </w:pPr>
+            <w:r>
+              <w:rPr>
+                <w:color w:val="1F2937"/>
+                <w:sz w:val="22"/>
+              </w:rPr>
+              <w:t>OS Command Injection (RCE)</w:t>
+            </w:r>
+          </w:p>
+        </w:tc>
+        <w:tc>
+          <w:tcPr>
+            <w:tcW w:type="dxa" w:w="1440"/>
+            <w:shd w:fill="F9FAFB"/>
+            <w:tcMar>
+              <w:top w:w="80" w:type="dxa"/>
+              <w:bottom w:w="80" w:type="dxa"/>
+              <w:left w:w="100" w:type="dxa"/>
+              <w:right w:w="100" w:type="dxa"/>
+            </w:tcMar>
+          </w:tcPr>
+          <w:p>
+            <w:pPr>
+              <w:jc w:val="left"/>
+            </w:pPr>
+            <w:r>
+              <w:rPr>
+                <w:color w:val="1F2937"/>
+                <w:sz w:val="22"/>
+              </w:rPr>
+              <w:t>200</w:t>
+            </w:r>
+          </w:p>
+        </w:tc>
+        <w:tc>
+          <w:tcPr>
+            <w:tcW w:type="dxa" w:w="2160"/>
+            <w:shd w:fill="F9FAFB"/>
+            <w:tcMar>
+              <w:top w:w="80" w:type="dxa"/>
+              <w:bottom w:w="80" w:type="dxa"/>
+              <w:left w:w="100" w:type="dxa"/>
+              <w:right w:w="100" w:type="dxa"/>
+            </w:tcMar>
+          </w:tcPr>
+          <w:p>
+            <w:pPr>
+              <w:jc w:val="left"/>
+            </w:pPr>
+            <w:r>
+              <w:rPr>
+                <w:color w:val="1F2937"/>
+                <w:sz w:val="22"/>
+              </w:rPr>
+              <w:t>173</w:t>
+            </w:r>
+          </w:p>
+        </w:tc>
+        <w:tc>
+          <w:tcPr>
+            <w:tcW w:type="dxa" w:w="2160"/>
+            <w:shd w:fill="F9FAFB"/>
+            <w:tcMar>
+              <w:top w:w="80" w:type="dxa"/>
+              <w:bottom w:w="80" w:type="dxa"/>
+              <w:left w:w="100" w:type="dxa"/>
+              <w:right w:w="100" w:type="dxa"/>
+            </w:tcMar>
+          </w:tcPr>
+          <w:p>
+            <w:pPr>
+              <w:jc w:val="left"/>
+            </w:pPr>
+            <w:r>
+              <w:rPr>
+                <w:color w:val="1F2937"/>
+                <w:sz w:val="22"/>
+              </w:rPr>
+              <w:t>27</w:t>
+            </w:r>
+          </w:p>
+        </w:tc>
+        <w:tc>
+          <w:tcPr>
+            <w:tcW w:type="dxa" w:w="1728"/>
+            <w:shd w:fill="F9FAFB"/>
+            <w:tcMar>
+              <w:top w:w="80" w:type="dxa"/>
+              <w:bottom w:w="80" w:type="dxa"/>
+              <w:left w:w="100" w:type="dxa"/>
+              <w:right w:w="100" w:type="dxa"/>
+            </w:tcMar>
+          </w:tcPr>
+          <w:p>
+            <w:pPr>
+              <w:jc w:val="left"/>
+            </w:pPr>
+            <w:r>
+              <w:rPr>
+                <w:color w:val="1F2937"/>
+                <w:sz w:val="22"/>
+              </w:rPr>
+              <w:t>86.50% BLOCKED</w:t>
+            </w:r>
+          </w:p>
+        </w:tc>
+      </w:tr>
+      <w:tr>
+        <w:tc>
+          <w:tcPr>
+            <w:tcW w:type="dxa" w:w="2880"/>
+            <w:shd w:fill="FFFFFF"/>
+            <w:tcMar>
+              <w:top w:w="80" w:type="dxa"/>
+              <w:bottom w:w="80" w:type="dxa"/>
+              <w:left w:w="100" w:type="dxa"/>
+              <w:right w:w="100" w:type="dxa"/>
+            </w:tcMar>
+          </w:tcPr>
+          <w:p>
+            <w:pPr>
+              <w:jc w:val="center"/>
+            </w:pPr>
+            <w:r>
+              <w:rPr>
+                <w:color w:val="1F2937"/>
+                <w:sz w:val="22"/>
+              </w:rPr>
+              <w:t>Lưu Lượng Hợp Lệ (Benign)</w:t>
+            </w:r>
+          </w:p>
+        </w:tc>
+        <w:tc>
+          <w:tcPr>
+            <w:tcW w:type="dxa" w:w="1440"/>
+            <w:shd w:fill="FFFFFF"/>
+            <w:tcMar>
+              <w:top w:w="80" w:type="dxa"/>
+              <w:bottom w:w="80" w:type="dxa"/>
+              <w:left w:w="100" w:type="dxa"/>
+              <w:right w:w="100" w:type="dxa"/>
+            </w:tcMar>
+          </w:tcPr>
+          <w:p>
+            <w:pPr>
+              <w:jc w:val="left"/>
+            </w:pPr>
+            <w:r>
+              <w:rPr>
+                <w:color w:val="1F2937"/>
+                <w:sz w:val="22"/>
+              </w:rPr>
+              <w:t>200</w:t>
+            </w:r>
+          </w:p>
+        </w:tc>
+        <w:tc>
+          <w:tcPr>
+            <w:tcW w:type="dxa" w:w="2160"/>
+            <w:shd w:fill="FFFFFF"/>
+            <w:tcMar>
+              <w:top w:w="80" w:type="dxa"/>
+              <w:bottom w:w="80" w:type="dxa"/>
+              <w:left w:w="100" w:type="dxa"/>
+              <w:right w:w="100" w:type="dxa"/>
+            </w:tcMar>
+          </w:tcPr>
+          <w:p>
+            <w:pPr>
+              <w:jc w:val="left"/>
+            </w:pPr>
+            <w:r>
+              <w:rPr>
+                <w:color w:val="1F2937"/>
+                <w:sz w:val="22"/>
+              </w:rPr>
+              <w:t>30</w:t>
+            </w:r>
+          </w:p>
+        </w:tc>
+        <w:tc>
+          <w:tcPr>
+            <w:tcW w:type="dxa" w:w="2160"/>
+            <w:shd w:fill="FFFFFF"/>
+            <w:tcMar>
+              <w:top w:w="80" w:type="dxa"/>
+              <w:bottom w:w="80" w:type="dxa"/>
+              <w:left w:w="100" w:type="dxa"/>
+              <w:right w:w="100" w:type="dxa"/>
+            </w:tcMar>
+          </w:tcPr>
+          <w:p>
+            <w:pPr>
+              <w:jc w:val="left"/>
+            </w:pPr>
+            <w:r>
+              <w:rPr>
+                <w:color w:val="1F2937"/>
+                <w:sz w:val="22"/>
+              </w:rPr>
+              <w:t>170</w:t>
+            </w:r>
+          </w:p>
+        </w:tc>
+        <w:tc>
+          <w:tcPr>
+            <w:tcW w:type="dxa" w:w="1728"/>
+            <w:shd w:fill="FFFFFF"/>
+            <w:tcMar>
+              <w:top w:w="80" w:type="dxa"/>
+              <w:bottom w:w="80" w:type="dxa"/>
+              <w:left w:w="100" w:type="dxa"/>
+              <w:right w:w="100" w:type="dxa"/>
+            </w:tcMar>
+          </w:tcPr>
+          <w:p>
+            <w:pPr>
+              <w:jc w:val="left"/>
+            </w:pPr>
+            <w:r>
+              <w:rPr>
+                <w:color w:val="1F2937"/>
+                <w:sz w:val="22"/>
+              </w:rPr>
+              <w:t>85.00% ALLOWED</w:t>
+            </w:r>
+          </w:p>
+        </w:tc>
+      </w:tr>
+    </w:tbl>
+    <w:p>
+      <w:pPr>
+        <w:spacing w:after="120"/>
+      </w:pPr>
+    </w:p>
+    <w:p>
+      <w:pPr>
+        <w:spacing w:line="312" w:lineRule="auto" w:after="80"/>
+        <w:jc w:val="both"/>
+      </w:pPr>
+      <w:r>
+        <w:rPr>
+          <w:sz w:val="26"/>
+        </w:rPr>
+        <w:t>Thời gian thực thi toàn bộ 1.000 requests là 44.17 giây, thông lượng đạt 22.6 RPS qua kết nối Wi-Fi thực tế:</w:t>
+      </w:r>
+    </w:p>
+    <w:p>
+      <w:pPr>
+        <w:pStyle w:val="ListBullet"/>
+        <w:spacing w:line="312" w:lineRule="auto" w:after="60"/>
+        <w:jc w:val="both"/>
+      </w:pPr>
+      <w:r>
+        <w:rPr>
+          <w:b/>
+        </w:rPr>
+        <w:t>• Độ trễ trung bình toàn trình:</w:t>
+      </w:r>
+      <w:r>
+        <w:rPr>
+          <w:sz w:val="26"/>
+        </w:rPr>
+        <w:t xml:space="preserve"> 327.41 ms (Độ trễ trung vị P50: 326.34 ms).</w:t>
+      </w:r>
+    </w:p>
+    <w:p>
+      <w:pPr>
+        <w:pStyle w:val="ListBullet"/>
+        <w:spacing w:line="312" w:lineRule="auto" w:after="60"/>
+        <w:jc w:val="both"/>
+      </w:pPr>
+      <w:r>
+        <w:rPr>
+          <w:b/>
+        </w:rPr>
+        <w:t>• Phân vị độ trễ SLA:</w:t>
+      </w:r>
+      <w:r>
+        <w:rPr>
+          <w:sz w:val="26"/>
+        </w:rPr>
+        <w:t xml:space="preserve"> P90 = 443.82 ms, P95 SLA = 481.05 ms, P99 Max = 555.63 ms.</w:t>
+      </w:r>
+    </w:p>
+    <w:p>
+      <w:pPr>
+        <w:pStyle w:val="ListBullet"/>
+        <w:spacing w:line="312" w:lineRule="auto" w:after="60"/>
+        <w:jc w:val="both"/>
+      </w:pPr>
+      <w:r>
+        <w:rPr>
+          <w:b/>
+        </w:rPr>
+        <w:t>• Độ trễ nội bộ WAF Gateway:</w:t>
+      </w:r>
+      <w:r>
+        <w:rPr>
+          <w:sz w:val="26"/>
+        </w:rPr>
+        <w:t xml:space="preserve"> Chỉ chiếm xấp xỉ 0.040 ms, phần lớn độ trễ còn lại là do truyền dẫn sóng vô tuyến Wi-Fi và I/O cơ sở dữ liệu của ứng dụng mục tiêu.</w:t>
+      </w:r>
+    </w:p>
+    <w:p>
+      <w:pPr>
+        <w:spacing w:before="280" w:after="120"/>
+      </w:pPr>
+      <w:r>
+        <w:rPr>
+          <w:b/>
+          <w:color w:val="0F766E"/>
+          <w:sz w:val="30"/>
+        </w:rPr>
+        <w:t>4.5. ĐÁNH GIÁ KHẢ NĂNG TỔNG QUÁT HÓA LIÊN TẬP DỮ LIỆU (CSIC 2010 BENCHMARK)</w:t>
+      </w:r>
+    </w:p>
+    <w:p>
+      <w:pPr>
+        <w:spacing w:line="312" w:lineRule="auto" w:after="80"/>
+        <w:jc w:val="both"/>
+      </w:pPr>
+      <w:r>
+        <w:rPr>
+          <w:sz w:val="26"/>
+        </w:rPr>
+        <w:t>Nhằm chứng minh tính khách quan khoa học và khẳng định mô hình không bị phụ thuộc vào dữ liệu nội bộ (Overfitting to Synthetic Data), nhóm nghiên cứu đã tiến hành đánh giá chéo trên 3.000 mẫu thuộc tập dữ liệu thực tế chuẩn quốc tế CSIC 2010 (Viện Nghiên cứu CSIC, Tây Ban Nha) [Ref 08] (Bảng 4.7):</w:t>
+      </w:r>
+    </w:p>
+    <w:p>
+      <w:pPr>
+        <w:spacing w:before="200" w:after="80"/>
+        <w:jc w:val="center"/>
+      </w:pPr>
+      <w:r>
+        <w:rPr>
+          <w:b/>
+          <w:color w:val="1E3A8A"/>
+          <w:sz w:val="24"/>
+        </w:rPr>
+        <w:t>Bảng 4.7: Bảng đối sánh khoa học: Tập nội bộ vs Chuẩn quốc tế CSIC 2010</w:t>
+      </w:r>
+    </w:p>
+    <w:tbl>
+      <w:tblPr>
+        <w:tblW w:type="auto" w:w="0"/>
+        <w:jc w:val="center"/>
+        <w:tblLook w:firstColumn="1" w:firstRow="1" w:lastColumn="0" w:lastRow="0" w:noHBand="0" w:noVBand="1" w:val="04A0"/>
+      </w:tblPr>
+      <w:tblGrid>
+        <w:gridCol w:w="1825"/>
+        <w:gridCol w:w="1825"/>
+        <w:gridCol w:w="1825"/>
+        <w:gridCol w:w="1825"/>
+        <w:gridCol w:w="1825"/>
+      </w:tblGrid>
+      <w:tr>
+        <w:tc>
+          <w:tcPr>
+            <w:tcW w:type="dxa" w:w="2592"/>
+            <w:shd w:fill="0F766E"/>
+            <w:tcMar>
+              <w:top w:w="100" w:type="dxa"/>
+              <w:bottom w:w="100" w:type="dxa"/>
+              <w:left w:w="120" w:type="dxa"/>
+              <w:right w:w="120" w:type="dxa"/>
+            </w:tcMar>
+          </w:tcPr>
+          <w:p>
+            <w:pPr>
+              <w:jc w:val="center"/>
+            </w:pPr>
+            <w:r>
+              <w:rPr>
+                <w:b/>
+                <w:color w:val="FFFFFF"/>
+                <w:sz w:val="22"/>
+              </w:rPr>
+              <w:t>Chỉ Số Đánh Giá (Metric)</w:t>
             </w:r>
           </w:p>
         </w:tc>
@@ -4677,7 +5855,7 @@
                 <w:color w:val="FFFFFF"/>
                 <w:sz w:val="22"/>
               </w:rPr>
-              <w:t>Giá Trị Đạt Được</w:t>
+              <w:t>Tập Nội Bộ (Synthetic Test)</w:t>
             </w:r>
           </w:p>
         </w:tc>
@@ -4702,13 +5880,13 @@
                 <w:color w:val="FFFFFF"/>
                 <w:sz w:val="22"/>
               </w:rPr>
-              <w:t>Ngưỡng Cam Kết (SLA)</w:t>
+              <w:t>Chuẩn Quốc Tế (CSIC 2010)</w:t>
             </w:r>
           </w:p>
         </w:tc>
         <w:tc>
           <w:tcPr>
-            <w:tcW w:type="dxa" w:w="3456"/>
+            <w:tcW w:type="dxa" w:w="1296"/>
             <w:shd w:fill="0F766E"/>
             <w:tcMar>
               <w:top w:w="100" w:type="dxa"/>
@@ -4727,857 +5905,13 @@
                 <w:color w:val="FFFFFF"/>
                 <w:sz w:val="22"/>
               </w:rPr>
-              <w:t>Đánh Giá Tuân Thủ</w:t>
-            </w:r>
-          </w:p>
-        </w:tc>
-      </w:tr>
-      <w:tr>
-        <w:tc>
-          <w:tcPr>
-            <w:tcW w:type="dxa" w:w="3168"/>
-            <w:shd w:fill="FFFFFF"/>
-            <w:tcMar>
-              <w:top w:w="80" w:type="dxa"/>
-              <w:bottom w:w="80" w:type="dxa"/>
-              <w:left w:w="100" w:type="dxa"/>
-              <w:right w:w="100" w:type="dxa"/>
-            </w:tcMar>
-          </w:tcPr>
-          <w:p>
-            <w:pPr>
-              <w:jc w:val="center"/>
-            </w:pPr>
-            <w:r>
-              <w:rPr>
-                <w:color w:val="1F2937"/>
-                <w:sz w:val="22"/>
-              </w:rPr>
-              <w:t>Tổng Số Request Đã Phát</w:t>
+              <w:t>Chênh Lệch</w:t>
             </w:r>
           </w:p>
         </w:tc>
         <w:tc>
           <w:tcPr>
-            <w:tcW w:type="dxa" w:w="2016"/>
-            <w:shd w:fill="FFFFFF"/>
-            <w:tcMar>
-              <w:top w:w="80" w:type="dxa"/>
-              <w:bottom w:w="80" w:type="dxa"/>
-              <w:left w:w="100" w:type="dxa"/>
-              <w:right w:w="100" w:type="dxa"/>
-            </w:tcMar>
-          </w:tcPr>
-          <w:p>
-            <w:pPr>
-              <w:jc w:val="left"/>
-            </w:pPr>
-            <w:r>
-              <w:rPr>
-                <w:color w:val="1F2937"/>
-                <w:sz w:val="22"/>
-              </w:rPr>
-              <w:t>1.000</w:t>
-            </w:r>
-          </w:p>
-        </w:tc>
-        <w:tc>
-          <w:tcPr>
-            <w:tcW w:type="dxa" w:w="2016"/>
-            <w:shd w:fill="FFFFFF"/>
-            <w:tcMar>
-              <w:top w:w="80" w:type="dxa"/>
-              <w:bottom w:w="80" w:type="dxa"/>
-              <w:left w:w="100" w:type="dxa"/>
-              <w:right w:w="100" w:type="dxa"/>
-            </w:tcMar>
-          </w:tcPr>
-          <w:p>
-            <w:pPr>
-              <w:jc w:val="left"/>
-            </w:pPr>
-            <w:r>
-              <w:rPr>
-                <w:color w:val="1F2937"/>
-                <w:sz w:val="22"/>
-              </w:rPr>
-              <w:t>1.000</w:t>
-            </w:r>
-          </w:p>
-        </w:tc>
-        <w:tc>
-          <w:tcPr>
-            <w:tcW w:type="dxa" w:w="3456"/>
-            <w:shd w:fill="FFFFFF"/>
-            <w:tcMar>
-              <w:top w:w="80" w:type="dxa"/>
-              <w:bottom w:w="80" w:type="dxa"/>
-              <w:left w:w="100" w:type="dxa"/>
-              <w:right w:w="100" w:type="dxa"/>
-            </w:tcMar>
-          </w:tcPr>
-          <w:p>
-            <w:pPr>
-              <w:jc w:val="left"/>
-            </w:pPr>
-            <w:r>
-              <w:rPr>
-                <w:color w:val="1F2937"/>
-                <w:sz w:val="22"/>
-              </w:rPr>
-              <w:t>Hoàn thành 100% kịch bản</w:t>
-            </w:r>
-          </w:p>
-        </w:tc>
-      </w:tr>
-      <w:tr>
-        <w:tc>
-          <w:tcPr>
-            <w:tcW w:type="dxa" w:w="3168"/>
-            <w:shd w:fill="F9FAFB"/>
-            <w:tcMar>
-              <w:top w:w="80" w:type="dxa"/>
-              <w:bottom w:w="80" w:type="dxa"/>
-              <w:left w:w="100" w:type="dxa"/>
-              <w:right w:w="100" w:type="dxa"/>
-            </w:tcMar>
-          </w:tcPr>
-          <w:p>
-            <w:pPr>
-              <w:jc w:val="center"/>
-            </w:pPr>
-            <w:r>
-              <w:rPr>
-                <w:color w:val="1F2937"/>
-                <w:sz w:val="22"/>
-              </w:rPr>
-              <w:t>Tỷ Lệ Bắt Giữ Tấn Công (Attack Block Rate)</w:t>
-            </w:r>
-          </w:p>
-        </w:tc>
-        <w:tc>
-          <w:tcPr>
-            <w:tcW w:type="dxa" w:w="2016"/>
-            <w:shd w:fill="F9FAFB"/>
-            <w:tcMar>
-              <w:top w:w="80" w:type="dxa"/>
-              <w:bottom w:w="80" w:type="dxa"/>
-              <w:left w:w="100" w:type="dxa"/>
-              <w:right w:w="100" w:type="dxa"/>
-            </w:tcMar>
-          </w:tcPr>
-          <w:p>
-            <w:pPr>
-              <w:jc w:val="left"/>
-            </w:pPr>
-            <w:r>
-              <w:rPr>
-                <w:color w:val="1F2937"/>
-                <w:sz w:val="22"/>
-              </w:rPr>
-              <w:t>91.38% (731 / 800)</w:t>
-            </w:r>
-          </w:p>
-        </w:tc>
-        <w:tc>
-          <w:tcPr>
-            <w:tcW w:type="dxa" w:w="2016"/>
-            <w:shd w:fill="F9FAFB"/>
-            <w:tcMar>
-              <w:top w:w="80" w:type="dxa"/>
-              <w:bottom w:w="80" w:type="dxa"/>
-              <w:left w:w="100" w:type="dxa"/>
-              <w:right w:w="100" w:type="dxa"/>
-            </w:tcMar>
-          </w:tcPr>
-          <w:p>
-            <w:pPr>
-              <w:jc w:val="left"/>
-            </w:pPr>
-            <w:r>
-              <w:rPr>
-                <w:color w:val="1F2937"/>
-                <w:sz w:val="22"/>
-              </w:rPr>
-              <w:t>&gt;= 90.0%</w:t>
-            </w:r>
-          </w:p>
-        </w:tc>
-        <w:tc>
-          <w:tcPr>
-            <w:tcW w:type="dxa" w:w="3456"/>
-            <w:shd w:fill="F9FAFB"/>
-            <w:tcMar>
-              <w:top w:w="80" w:type="dxa"/>
-              <w:bottom w:w="80" w:type="dxa"/>
-              <w:left w:w="100" w:type="dxa"/>
-              <w:right w:w="100" w:type="dxa"/>
-            </w:tcMar>
-          </w:tcPr>
-          <w:p>
-            <w:pPr>
-              <w:jc w:val="left"/>
-            </w:pPr>
-            <w:r>
-              <w:rPr>
-                <w:color w:val="1F2937"/>
-                <w:sz w:val="22"/>
-              </w:rPr>
-              <w:t>ĐẠT CHUẨN XUẤT SẮC</w:t>
-            </w:r>
-          </w:p>
-        </w:tc>
-      </w:tr>
-      <w:tr>
-        <w:tc>
-          <w:tcPr>
-            <w:tcW w:type="dxa" w:w="3168"/>
-            <w:shd w:fill="FFFFFF"/>
-            <w:tcMar>
-              <w:top w:w="80" w:type="dxa"/>
-              <w:bottom w:w="80" w:type="dxa"/>
-              <w:left w:w="100" w:type="dxa"/>
-              <w:right w:w="100" w:type="dxa"/>
-            </w:tcMar>
-          </w:tcPr>
-          <w:p>
-            <w:pPr>
-              <w:jc w:val="center"/>
-            </w:pPr>
-            <w:r>
-              <w:rPr>
-                <w:color w:val="1F2937"/>
-                <w:sz w:val="22"/>
-              </w:rPr>
-              <w:t>Độ Chuẩn Xác Cảnh Báo (Precision)</w:t>
-            </w:r>
-          </w:p>
-        </w:tc>
-        <w:tc>
-          <w:tcPr>
-            <w:tcW w:type="dxa" w:w="2016"/>
-            <w:shd w:fill="FFFFFF"/>
-            <w:tcMar>
-              <w:top w:w="80" w:type="dxa"/>
-              <w:bottom w:w="80" w:type="dxa"/>
-              <w:left w:w="100" w:type="dxa"/>
-              <w:right w:w="100" w:type="dxa"/>
-            </w:tcMar>
-          </w:tcPr>
-          <w:p>
-            <w:pPr>
-              <w:jc w:val="left"/>
-            </w:pPr>
-            <w:r>
-              <w:rPr>
-                <w:color w:val="1F2937"/>
-                <w:sz w:val="22"/>
-              </w:rPr>
-              <w:t>96.06% (731 / 761)</w:t>
-            </w:r>
-          </w:p>
-        </w:tc>
-        <w:tc>
-          <w:tcPr>
-            <w:tcW w:type="dxa" w:w="2016"/>
-            <w:shd w:fill="FFFFFF"/>
-            <w:tcMar>
-              <w:top w:w="80" w:type="dxa"/>
-              <w:bottom w:w="80" w:type="dxa"/>
-              <w:left w:w="100" w:type="dxa"/>
-              <w:right w:w="100" w:type="dxa"/>
-            </w:tcMar>
-          </w:tcPr>
-          <w:p>
-            <w:pPr>
-              <w:jc w:val="left"/>
-            </w:pPr>
-            <w:r>
-              <w:rPr>
-                <w:color w:val="1F2937"/>
-                <w:sz w:val="22"/>
-              </w:rPr>
-              <w:t>&gt;= 95.0%</w:t>
-            </w:r>
-          </w:p>
-        </w:tc>
-        <w:tc>
-          <w:tcPr>
-            <w:tcW w:type="dxa" w:w="3456"/>
-            <w:shd w:fill="FFFFFF"/>
-            <w:tcMar>
-              <w:top w:w="80" w:type="dxa"/>
-              <w:bottom w:w="80" w:type="dxa"/>
-              <w:left w:w="100" w:type="dxa"/>
-              <w:right w:w="100" w:type="dxa"/>
-            </w:tcMar>
-          </w:tcPr>
-          <w:p>
-            <w:pPr>
-              <w:jc w:val="left"/>
-            </w:pPr>
-            <w:r>
-              <w:rPr>
-                <w:color w:val="1F2937"/>
-                <w:sz w:val="22"/>
-              </w:rPr>
-              <w:t>ĐẠT CHUẨN XUẤT SẮC</w:t>
-            </w:r>
-          </w:p>
-        </w:tc>
-      </w:tr>
-      <w:tr>
-        <w:tc>
-          <w:tcPr>
-            <w:tcW w:type="dxa" w:w="3168"/>
-            <w:shd w:fill="F9FAFB"/>
-            <w:tcMar>
-              <w:top w:w="80" w:type="dxa"/>
-              <w:bottom w:w="80" w:type="dxa"/>
-              <w:left w:w="100" w:type="dxa"/>
-              <w:right w:w="100" w:type="dxa"/>
-            </w:tcMar>
-          </w:tcPr>
-          <w:p>
-            <w:pPr>
-              <w:jc w:val="center"/>
-            </w:pPr>
-            <w:r>
-              <w:rPr>
-                <w:color w:val="1F2937"/>
-                <w:sz w:val="22"/>
-              </w:rPr>
-              <w:t>Tỷ Lệ Cho Qua Lưu Lượng Sạch (Benign Allowed)</w:t>
-            </w:r>
-          </w:p>
-        </w:tc>
-        <w:tc>
-          <w:tcPr>
-            <w:tcW w:type="dxa" w:w="2016"/>
-            <w:shd w:fill="F9FAFB"/>
-            <w:tcMar>
-              <w:top w:w="80" w:type="dxa"/>
-              <w:bottom w:w="80" w:type="dxa"/>
-              <w:left w:w="100" w:type="dxa"/>
-              <w:right w:w="100" w:type="dxa"/>
-            </w:tcMar>
-          </w:tcPr>
-          <w:p>
-            <w:pPr>
-              <w:jc w:val="left"/>
-            </w:pPr>
-            <w:r>
-              <w:rPr>
-                <w:color w:val="1F2937"/>
-                <w:sz w:val="22"/>
-              </w:rPr>
-              <w:t>85.00% (170 / 200)</w:t>
-            </w:r>
-          </w:p>
-        </w:tc>
-        <w:tc>
-          <w:tcPr>
-            <w:tcW w:type="dxa" w:w="2016"/>
-            <w:shd w:fill="F9FAFB"/>
-            <w:tcMar>
-              <w:top w:w="80" w:type="dxa"/>
-              <w:bottom w:w="80" w:type="dxa"/>
-              <w:left w:w="100" w:type="dxa"/>
-              <w:right w:w="100" w:type="dxa"/>
-            </w:tcMar>
-          </w:tcPr>
-          <w:p>
-            <w:pPr>
-              <w:jc w:val="left"/>
-            </w:pPr>
-            <w:r>
-              <w:rPr>
-                <w:color w:val="1F2937"/>
-                <w:sz w:val="22"/>
-              </w:rPr>
-              <w:t>&gt;= 80.0%</w:t>
-            </w:r>
-          </w:p>
-        </w:tc>
-        <w:tc>
-          <w:tcPr>
-            <w:tcW w:type="dxa" w:w="3456"/>
-            <w:shd w:fill="F9FAFB"/>
-            <w:tcMar>
-              <w:top w:w="80" w:type="dxa"/>
-              <w:bottom w:w="80" w:type="dxa"/>
-              <w:left w:w="100" w:type="dxa"/>
-              <w:right w:w="100" w:type="dxa"/>
-            </w:tcMar>
-          </w:tcPr>
-          <w:p>
-            <w:pPr>
-              <w:jc w:val="left"/>
-            </w:pPr>
-            <w:r>
-              <w:rPr>
-                <w:color w:val="1F2937"/>
-                <w:sz w:val="22"/>
-              </w:rPr>
-              <w:t>ĐẠT CHUẨN VẬN HÀNH</w:t>
-            </w:r>
-          </w:p>
-        </w:tc>
-      </w:tr>
-      <w:tr>
-        <w:tc>
-          <w:tcPr>
-            <w:tcW w:type="dxa" w:w="3168"/>
-            <w:shd w:fill="FFFFFF"/>
-            <w:tcMar>
-              <w:top w:w="80" w:type="dxa"/>
-              <w:bottom w:w="80" w:type="dxa"/>
-              <w:left w:w="100" w:type="dxa"/>
-              <w:right w:w="100" w:type="dxa"/>
-            </w:tcMar>
-          </w:tcPr>
-          <w:p>
-            <w:pPr>
-              <w:jc w:val="center"/>
-            </w:pPr>
-            <w:r>
-              <w:rPr>
-                <w:color w:val="1F2937"/>
-                <w:sz w:val="22"/>
-              </w:rPr>
-              <w:t>Thời Gian Thực Thi Toàn Trình (Total Duration)</w:t>
-            </w:r>
-          </w:p>
-        </w:tc>
-        <w:tc>
-          <w:tcPr>
-            <w:tcW w:type="dxa" w:w="2016"/>
-            <w:shd w:fill="FFFFFF"/>
-            <w:tcMar>
-              <w:top w:w="80" w:type="dxa"/>
-              <w:bottom w:w="80" w:type="dxa"/>
-              <w:left w:w="100" w:type="dxa"/>
-              <w:right w:w="100" w:type="dxa"/>
-            </w:tcMar>
-          </w:tcPr>
-          <w:p>
-            <w:pPr>
-              <w:jc w:val="left"/>
-            </w:pPr>
-            <w:r>
-              <w:rPr>
-                <w:color w:val="1F2937"/>
-                <w:sz w:val="22"/>
-              </w:rPr>
-              <w:t>44.17 giây</w:t>
-            </w:r>
-          </w:p>
-        </w:tc>
-        <w:tc>
-          <w:tcPr>
-            <w:tcW w:type="dxa" w:w="2016"/>
-            <w:shd w:fill="FFFFFF"/>
-            <w:tcMar>
-              <w:top w:w="80" w:type="dxa"/>
-              <w:bottom w:w="80" w:type="dxa"/>
-              <w:left w:w="100" w:type="dxa"/>
-              <w:right w:w="100" w:type="dxa"/>
-            </w:tcMar>
-          </w:tcPr>
-          <w:p>
-            <w:pPr>
-              <w:jc w:val="left"/>
-            </w:pPr>
-            <w:r>
-              <w:rPr>
-                <w:color w:val="1F2937"/>
-                <w:sz w:val="22"/>
-              </w:rPr>
-              <w:t>&lt;= 60 giây</w:t>
-            </w:r>
-          </w:p>
-        </w:tc>
-        <w:tc>
-          <w:tcPr>
-            <w:tcW w:type="dxa" w:w="3456"/>
-            <w:shd w:fill="FFFFFF"/>
-            <w:tcMar>
-              <w:top w:w="80" w:type="dxa"/>
-              <w:bottom w:w="80" w:type="dxa"/>
-              <w:left w:w="100" w:type="dxa"/>
-              <w:right w:w="100" w:type="dxa"/>
-            </w:tcMar>
-          </w:tcPr>
-          <w:p>
-            <w:pPr>
-              <w:jc w:val="left"/>
-            </w:pPr>
-            <w:r>
-              <w:rPr>
-                <w:color w:val="1F2937"/>
-                <w:sz w:val="22"/>
-              </w:rPr>
-              <w:t>ĐẠT HIỆU QUẢ CAO</w:t>
-            </w:r>
-          </w:p>
-        </w:tc>
-      </w:tr>
-      <w:tr>
-        <w:tc>
-          <w:tcPr>
-            <w:tcW w:type="dxa" w:w="3168"/>
-            <w:shd w:fill="F9FAFB"/>
-            <w:tcMar>
-              <w:top w:w="80" w:type="dxa"/>
-              <w:bottom w:w="80" w:type="dxa"/>
-              <w:left w:w="100" w:type="dxa"/>
-              <w:right w:w="100" w:type="dxa"/>
-            </w:tcMar>
-          </w:tcPr>
-          <w:p>
-            <w:pPr>
-              <w:jc w:val="center"/>
-            </w:pPr>
-            <w:r>
-              <w:rPr>
-                <w:color w:val="1F2937"/>
-                <w:sz w:val="22"/>
-              </w:rPr>
-              <w:t>Thông Lượng Thực Tế (Actual Throughput)</w:t>
-            </w:r>
-          </w:p>
-        </w:tc>
-        <w:tc>
-          <w:tcPr>
-            <w:tcW w:type="dxa" w:w="2016"/>
-            <w:shd w:fill="F9FAFB"/>
-            <w:tcMar>
-              <w:top w:w="80" w:type="dxa"/>
-              <w:bottom w:w="80" w:type="dxa"/>
-              <w:left w:w="100" w:type="dxa"/>
-              <w:right w:w="100" w:type="dxa"/>
-            </w:tcMar>
-          </w:tcPr>
-          <w:p>
-            <w:pPr>
-              <w:jc w:val="left"/>
-            </w:pPr>
-            <w:r>
-              <w:rPr>
-                <w:color w:val="1F2937"/>
-                <w:sz w:val="22"/>
-              </w:rPr>
-              <w:t>22.64 RPS</w:t>
-            </w:r>
-          </w:p>
-        </w:tc>
-        <w:tc>
-          <w:tcPr>
-            <w:tcW w:type="dxa" w:w="2016"/>
-            <w:shd w:fill="F9FAFB"/>
-            <w:tcMar>
-              <w:top w:w="80" w:type="dxa"/>
-              <w:bottom w:w="80" w:type="dxa"/>
-              <w:left w:w="100" w:type="dxa"/>
-              <w:right w:w="100" w:type="dxa"/>
-            </w:tcMar>
-          </w:tcPr>
-          <w:p>
-            <w:pPr>
-              <w:jc w:val="left"/>
-            </w:pPr>
-            <w:r>
-              <w:rPr>
-                <w:color w:val="1F2937"/>
-                <w:sz w:val="22"/>
-              </w:rPr>
-              <w:t>&gt;= 20 RPS</w:t>
-            </w:r>
-          </w:p>
-        </w:tc>
-        <w:tc>
-          <w:tcPr>
-            <w:tcW w:type="dxa" w:w="3456"/>
-            <w:shd w:fill="F9FAFB"/>
-            <w:tcMar>
-              <w:top w:w="80" w:type="dxa"/>
-              <w:bottom w:w="80" w:type="dxa"/>
-              <w:left w:w="100" w:type="dxa"/>
-              <w:right w:w="100" w:type="dxa"/>
-            </w:tcMar>
-          </w:tcPr>
-          <w:p>
-            <w:pPr>
-              <w:jc w:val="left"/>
-            </w:pPr>
-            <w:r>
-              <w:rPr>
-                <w:color w:val="1F2937"/>
-                <w:sz w:val="22"/>
-              </w:rPr>
-              <w:t>VƯỢT NGƯỠNG YÊU CẦU</w:t>
-            </w:r>
-          </w:p>
-        </w:tc>
-      </w:tr>
-      <w:tr>
-        <w:tc>
-          <w:tcPr>
-            <w:tcW w:type="dxa" w:w="3168"/>
-            <w:shd w:fill="FFFFFF"/>
-            <w:tcMar>
-              <w:top w:w="80" w:type="dxa"/>
-              <w:bottom w:w="80" w:type="dxa"/>
-              <w:left w:w="100" w:type="dxa"/>
-              <w:right w:w="100" w:type="dxa"/>
-            </w:tcMar>
-          </w:tcPr>
-          <w:p>
-            <w:pPr>
-              <w:jc w:val="center"/>
-            </w:pPr>
-            <w:r>
-              <w:rPr>
-                <w:color w:val="1F2937"/>
-                <w:sz w:val="22"/>
-              </w:rPr>
-              <w:t>Độ Trễ Phân Vị P95 (P95 Latency SLA)</w:t>
-            </w:r>
-          </w:p>
-        </w:tc>
-        <w:tc>
-          <w:tcPr>
-            <w:tcW w:type="dxa" w:w="2016"/>
-            <w:shd w:fill="FFFFFF"/>
-            <w:tcMar>
-              <w:top w:w="80" w:type="dxa"/>
-              <w:bottom w:w="80" w:type="dxa"/>
-              <w:left w:w="100" w:type="dxa"/>
-              <w:right w:w="100" w:type="dxa"/>
-            </w:tcMar>
-          </w:tcPr>
-          <w:p>
-            <w:pPr>
-              <w:jc w:val="left"/>
-            </w:pPr>
-            <w:r>
-              <w:rPr>
-                <w:color w:val="1F2937"/>
-                <w:sz w:val="22"/>
-              </w:rPr>
-              <w:t>481.05 ms</w:t>
-            </w:r>
-          </w:p>
-        </w:tc>
-        <w:tc>
-          <w:tcPr>
-            <w:tcW w:type="dxa" w:w="2016"/>
-            <w:shd w:fill="FFFFFF"/>
-            <w:tcMar>
-              <w:top w:w="80" w:type="dxa"/>
-              <w:bottom w:w="80" w:type="dxa"/>
-              <w:left w:w="100" w:type="dxa"/>
-              <w:right w:w="100" w:type="dxa"/>
-            </w:tcMar>
-          </w:tcPr>
-          <w:p>
-            <w:pPr>
-              <w:jc w:val="left"/>
-            </w:pPr>
-            <w:r>
-              <w:rPr>
-                <w:color w:val="1F2937"/>
-                <w:sz w:val="22"/>
-              </w:rPr>
-              <w:t>&lt;= 500 ms</w:t>
-            </w:r>
-          </w:p>
-        </w:tc>
-        <w:tc>
-          <w:tcPr>
-            <w:tcW w:type="dxa" w:w="3456"/>
-            <w:shd w:fill="FFFFFF"/>
-            <w:tcMar>
-              <w:top w:w="80" w:type="dxa"/>
-              <w:bottom w:w="80" w:type="dxa"/>
-              <w:left w:w="100" w:type="dxa"/>
-              <w:right w:w="100" w:type="dxa"/>
-            </w:tcMar>
-          </w:tcPr>
-          <w:p>
-            <w:pPr>
-              <w:jc w:val="left"/>
-            </w:pPr>
-            <w:r>
-              <w:rPr>
-                <w:color w:val="1F2937"/>
-                <w:sz w:val="22"/>
-              </w:rPr>
-              <w:t>TUÂN THỦ CAM KẾT SLA</w:t>
-            </w:r>
-          </w:p>
-        </w:tc>
-      </w:tr>
-      <w:tr>
-        <w:tc>
-          <w:tcPr>
-            <w:tcW w:type="dxa" w:w="3168"/>
-            <w:shd w:fill="F9FAFB"/>
-            <w:tcMar>
-              <w:top w:w="80" w:type="dxa"/>
-              <w:bottom w:w="80" w:type="dxa"/>
-              <w:left w:w="100" w:type="dxa"/>
-              <w:right w:w="100" w:type="dxa"/>
-            </w:tcMar>
-          </w:tcPr>
-          <w:p>
-            <w:pPr>
-              <w:jc w:val="center"/>
-            </w:pPr>
-            <w:r>
-              <w:rPr>
-                <w:color w:val="1F2937"/>
-                <w:sz w:val="22"/>
-              </w:rPr>
-              <w:t>Độ Trễ Trung Vị P50 (P50 Median)</w:t>
-            </w:r>
-          </w:p>
-        </w:tc>
-        <w:tc>
-          <w:tcPr>
-            <w:tcW w:type="dxa" w:w="2016"/>
-            <w:shd w:fill="F9FAFB"/>
-            <w:tcMar>
-              <w:top w:w="80" w:type="dxa"/>
-              <w:bottom w:w="80" w:type="dxa"/>
-              <w:left w:w="100" w:type="dxa"/>
-              <w:right w:w="100" w:type="dxa"/>
-            </w:tcMar>
-          </w:tcPr>
-          <w:p>
-            <w:pPr>
-              <w:jc w:val="left"/>
-            </w:pPr>
-            <w:r>
-              <w:rPr>
-                <w:color w:val="1F2937"/>
-                <w:sz w:val="22"/>
-              </w:rPr>
-              <w:t>326.34 ms</w:t>
-            </w:r>
-          </w:p>
-        </w:tc>
-        <w:tc>
-          <w:tcPr>
-            <w:tcW w:type="dxa" w:w="2016"/>
-            <w:shd w:fill="F9FAFB"/>
-            <w:tcMar>
-              <w:top w:w="80" w:type="dxa"/>
-              <w:bottom w:w="80" w:type="dxa"/>
-              <w:left w:w="100" w:type="dxa"/>
-              <w:right w:w="100" w:type="dxa"/>
-            </w:tcMar>
-          </w:tcPr>
-          <w:p>
-            <w:pPr>
-              <w:jc w:val="left"/>
-            </w:pPr>
-            <w:r>
-              <w:rPr>
-                <w:color w:val="1F2937"/>
-                <w:sz w:val="22"/>
-              </w:rPr>
-              <w:t>&lt;= 350 ms</w:t>
-            </w:r>
-          </w:p>
-        </w:tc>
-        <w:tc>
-          <w:tcPr>
-            <w:tcW w:type="dxa" w:w="3456"/>
-            <w:shd w:fill="F9FAFB"/>
-            <w:tcMar>
-              <w:top w:w="80" w:type="dxa"/>
-              <w:bottom w:w="80" w:type="dxa"/>
-              <w:left w:w="100" w:type="dxa"/>
-              <w:right w:w="100" w:type="dxa"/>
-            </w:tcMar>
-          </w:tcPr>
-          <w:p>
-            <w:pPr>
-              <w:jc w:val="left"/>
-            </w:pPr>
-            <w:r>
-              <w:rPr>
-                <w:color w:val="1F2937"/>
-                <w:sz w:val="22"/>
-              </w:rPr>
-              <w:t>VẬN HÀNH ỔN ĐỊNH</w:t>
-            </w:r>
-          </w:p>
-        </w:tc>
-      </w:tr>
-    </w:tbl>
-    <w:p>
-      <w:pPr>
-        <w:spacing w:after="120"/>
-      </w:pPr>
-    </w:p>
-    <w:p>
-      <w:pPr>
-        <w:spacing w:before="280" w:after="120"/>
-      </w:pPr>
-      <w:r>
-        <w:rPr>
-          <w:b/>
-          <w:color w:val="0F766E"/>
-          <w:sz w:val="30"/>
-        </w:rPr>
-        <w:t>4.5. ĐÁNH GIÁ NĂNG LỰC TỔNG QUÁT HÓA LIÊN TẬP DỮ LIỆU (CSIC 2010 BENCHMARK)</w:t>
-      </w:r>
-    </w:p>
-    <w:p>
-      <w:pPr>
-        <w:spacing w:line="312" w:lineRule="auto" w:after="80"/>
-        <w:jc w:val="both"/>
-      </w:pPr>
-      <w:r>
-        <w:rPr>
-          <w:sz w:val="26"/>
-        </w:rPr>
-        <w:t>Để chứng minh tính khách quan khoa học và khẳng định mô hình không bị quá khớp vào tập dữ liệu sinh nội bộ [Ref 14], nhóm nghiên cứu tiến hành kiểm thử trực tiếp mô hình Champion Random Forest trên 3.000 mẫu của tập dữ liệu chuẩn quốc tế CSIC 2010 (Bảng 4.6):</w:t>
-      </w:r>
-    </w:p>
-    <w:p>
-      <w:pPr>
-        <w:spacing w:before="200" w:after="80"/>
-        <w:jc w:val="center"/>
-      </w:pPr>
-      <w:r>
-        <w:rPr>
-          <w:b/>
-          <w:color w:val="1E3A8A"/>
-          <w:sz w:val="24"/>
-        </w:rPr>
-        <w:t>Bảng 4.6: Kết quả đối sánh khả năng tổng quát hóa trên tập chuẩn CSIC 2010</w:t>
-      </w:r>
-    </w:p>
-    <w:tbl>
-      <w:tblPr>
-        <w:tblW w:type="auto" w:w="0"/>
-        <w:jc w:val="center"/>
-        <w:tblLook w:firstColumn="1" w:firstRow="1" w:lastColumn="0" w:lastRow="0" w:noHBand="0" w:noVBand="1" w:val="04A0"/>
-      </w:tblPr>
-      <w:tblGrid>
-        <w:gridCol w:w="1825"/>
-        <w:gridCol w:w="1825"/>
-        <w:gridCol w:w="1825"/>
-        <w:gridCol w:w="1825"/>
-        <w:gridCol w:w="1825"/>
-      </w:tblGrid>
-      <w:tr>
-        <w:tc>
-          <w:tcPr>
-            <w:tcW w:type="dxa" w:w="2160"/>
+            <w:tcW w:type="dxa" w:w="2880"/>
             <w:shd w:fill="0F766E"/>
             <w:tcMar>
               <w:top w:w="100" w:type="dxa"/>
@@ -5596,107 +5930,7 @@
                 <w:color w:val="FFFFFF"/>
                 <w:sz w:val="22"/>
               </w:rPr>
-              <w:t>Chỉ Số Đánh Giá</w:t>
-            </w:r>
-          </w:p>
-        </w:tc>
-        <w:tc>
-          <w:tcPr>
-            <w:tcW w:type="dxa" w:w="2016"/>
-            <w:shd w:fill="0F766E"/>
-            <w:tcMar>
-              <w:top w:w="100" w:type="dxa"/>
-              <w:bottom w:w="100" w:type="dxa"/>
-              <w:left w:w="120" w:type="dxa"/>
-              <w:right w:w="120" w:type="dxa"/>
-            </w:tcMar>
-          </w:tcPr>
-          <w:p>
-            <w:pPr>
-              <w:jc w:val="center"/>
-            </w:pPr>
-            <w:r>
-              <w:rPr>
-                <w:b/>
-                <w:color w:val="FFFFFF"/>
-                <w:sz w:val="22"/>
-              </w:rPr>
-              <w:t>Tập Dữ Liệu Nội Bộ</w:t>
-            </w:r>
-          </w:p>
-        </w:tc>
-        <w:tc>
-          <w:tcPr>
-            <w:tcW w:type="dxa" w:w="2160"/>
-            <w:shd w:fill="0F766E"/>
-            <w:tcMar>
-              <w:top w:w="100" w:type="dxa"/>
-              <w:bottom w:w="100" w:type="dxa"/>
-              <w:left w:w="120" w:type="dxa"/>
-              <w:right w:w="120" w:type="dxa"/>
-            </w:tcMar>
-          </w:tcPr>
-          <w:p>
-            <w:pPr>
-              <w:jc w:val="center"/>
-            </w:pPr>
-            <w:r>
-              <w:rPr>
-                <w:b/>
-                <w:color w:val="FFFFFF"/>
-                <w:sz w:val="22"/>
-              </w:rPr>
-              <w:t>Tập Chuẩn Quốc Tế CSIC 2010</w:t>
-            </w:r>
-          </w:p>
-        </w:tc>
-        <w:tc>
-          <w:tcPr>
-            <w:tcW w:type="dxa" w:w="1728"/>
-            <w:shd w:fill="0F766E"/>
-            <w:tcMar>
-              <w:top w:w="100" w:type="dxa"/>
-              <w:bottom w:w="100" w:type="dxa"/>
-              <w:left w:w="120" w:type="dxa"/>
-              <w:right w:w="120" w:type="dxa"/>
-            </w:tcMar>
-          </w:tcPr>
-          <w:p>
-            <w:pPr>
-              <w:jc w:val="center"/>
-            </w:pPr>
-            <w:r>
-              <w:rPr>
-                <w:b/>
-                <w:color w:val="FFFFFF"/>
-                <w:sz w:val="22"/>
-              </w:rPr>
-              <w:t>Mức Độ Suy Giảm</w:t>
-            </w:r>
-          </w:p>
-        </w:tc>
-        <w:tc>
-          <w:tcPr>
-            <w:tcW w:type="dxa" w:w="2592"/>
-            <w:shd w:fill="0F766E"/>
-            <w:tcMar>
-              <w:top w:w="100" w:type="dxa"/>
-              <w:bottom w:w="100" w:type="dxa"/>
-              <w:left w:w="120" w:type="dxa"/>
-              <w:right w:w="120" w:type="dxa"/>
-            </w:tcMar>
-          </w:tcPr>
-          <w:p>
-            <w:pPr>
-              <w:jc w:val="center"/>
-            </w:pPr>
-            <w:r>
-              <w:rPr>
-                <w:b/>
-                <w:color w:val="FFFFFF"/>
-                <w:sz w:val="22"/>
-              </w:rPr>
-              <w:t>Nhận Xét Học Thuật</w:t>
+              <w:t>Đánh Giá Học Thuật</w:t>
             </w:r>
           </w:p>
         </w:tc>
@@ -5704,7 +5938,7 @@
       <w:tr>
         <w:tc>
           <w:tcPr>
-            <w:tcW w:type="dxa" w:w="2160"/>
+            <w:tcW w:type="dxa" w:w="2592"/>
             <w:shd w:fill="FFFFFF"/>
             <w:tcMar>
               <w:top w:w="80" w:type="dxa"/>
@@ -5722,7 +5956,7 @@
                 <w:color w:val="1F2937"/>
                 <w:sz w:val="22"/>
               </w:rPr>
-              <w:t>Accuracy</w:t>
+              <w:t>Độ chính xác (Accuracy)</w:t>
             </w:r>
           </w:p>
         </w:tc>
@@ -5752,7 +5986,7 @@
         </w:tc>
         <w:tc>
           <w:tcPr>
-            <w:tcW w:type="dxa" w:w="2160"/>
+            <w:tcW w:type="dxa" w:w="2016"/>
             <w:shd w:fill="FFFFFF"/>
             <w:tcMar>
               <w:top w:w="80" w:type="dxa"/>
@@ -5776,7 +6010,7 @@
         </w:tc>
         <w:tc>
           <w:tcPr>
-            <w:tcW w:type="dxa" w:w="1728"/>
+            <w:tcW w:type="dxa" w:w="1296"/>
             <w:shd w:fill="FFFFFF"/>
             <w:tcMar>
               <w:top w:w="80" w:type="dxa"/>
@@ -5800,7 +6034,7 @@
         </w:tc>
         <w:tc>
           <w:tcPr>
-            <w:tcW w:type="dxa" w:w="2592"/>
+            <w:tcW w:type="dxa" w:w="2880"/>
             <w:shd w:fill="FFFFFF"/>
             <w:tcMar>
               <w:top w:w="80" w:type="dxa"/>
@@ -5818,7 +6052,7 @@
                 <w:color w:val="1F2937"/>
                 <w:sz w:val="22"/>
               </w:rPr>
-              <w:t>Duy trì khả năng phân lớp ổn định</w:t>
+              <w:t>Duy trì khả năng nhận diện tốt trên dữ liệu lạ</w:t>
             </w:r>
           </w:p>
         </w:tc>
@@ -5826,7 +6060,7 @@
       <w:tr>
         <w:tc>
           <w:tcPr>
-            <w:tcW w:type="dxa" w:w="2160"/>
+            <w:tcW w:type="dxa" w:w="2592"/>
             <w:shd w:fill="F9FAFB"/>
             <w:tcMar>
               <w:top w:w="80" w:type="dxa"/>
@@ -5844,7 +6078,7 @@
                 <w:color w:val="1F2937"/>
                 <w:sz w:val="22"/>
               </w:rPr>
-              <w:t>Precision</w:t>
+              <w:t>Precision (Độ tin cậy)</w:t>
             </w:r>
           </w:p>
         </w:tc>
@@ -5874,7 +6108,7 @@
         </w:tc>
         <w:tc>
           <w:tcPr>
-            <w:tcW w:type="dxa" w:w="2160"/>
+            <w:tcW w:type="dxa" w:w="2016"/>
             <w:shd w:fill="F9FAFB"/>
             <w:tcMar>
               <w:top w:w="80" w:type="dxa"/>
@@ -5898,7 +6132,7 @@
         </w:tc>
         <w:tc>
           <w:tcPr>
-            <w:tcW w:type="dxa" w:w="1728"/>
+            <w:tcW w:type="dxa" w:w="1296"/>
             <w:shd w:fill="F9FAFB"/>
             <w:tcMar>
               <w:top w:w="80" w:type="dxa"/>
@@ -5922,7 +6156,7 @@
         </w:tc>
         <w:tc>
           <w:tcPr>
-            <w:tcW w:type="dxa" w:w="2592"/>
+            <w:tcW w:type="dxa" w:w="2880"/>
             <w:shd w:fill="F9FAFB"/>
             <w:tcMar>
               <w:top w:w="80" w:type="dxa"/>
@@ -5940,7 +6174,7 @@
                 <w:color w:val="1F2937"/>
                 <w:sz w:val="22"/>
               </w:rPr>
-              <w:t>Hạn chế tối đa cảnh báo giả</w:t>
+              <w:t>Hạn chế tối đa cảnh báo sai</w:t>
             </w:r>
           </w:p>
         </w:tc>
@@ -5948,7 +6182,7 @@
       <w:tr>
         <w:tc>
           <w:tcPr>
-            <w:tcW w:type="dxa" w:w="2160"/>
+            <w:tcW w:type="dxa" w:w="2592"/>
             <w:shd w:fill="FFFFFF"/>
             <w:tcMar>
               <w:top w:w="80" w:type="dxa"/>
@@ -5966,7 +6200,7 @@
                 <w:color w:val="1F2937"/>
                 <w:sz w:val="22"/>
               </w:rPr>
-              <w:t>Recall (Tấn công)</w:t>
+              <w:t>Recall (Tỷ lệ bắt mã độc)</w:t>
             </w:r>
           </w:p>
         </w:tc>
@@ -5996,7 +6230,7 @@
         </w:tc>
         <w:tc>
           <w:tcPr>
-            <w:tcW w:type="dxa" w:w="2160"/>
+            <w:tcW w:type="dxa" w:w="2016"/>
             <w:shd w:fill="FFFFFF"/>
             <w:tcMar>
               <w:top w:w="80" w:type="dxa"/>
@@ -6020,7 +6254,7 @@
         </w:tc>
         <w:tc>
           <w:tcPr>
-            <w:tcW w:type="dxa" w:w="1728"/>
+            <w:tcW w:type="dxa" w:w="1296"/>
             <w:shd w:fill="FFFFFF"/>
             <w:tcMar>
               <w:top w:w="80" w:type="dxa"/>
@@ -6044,7 +6278,7 @@
         </w:tc>
         <w:tc>
           <w:tcPr>
-            <w:tcW w:type="dxa" w:w="2592"/>
+            <w:tcW w:type="dxa" w:w="2880"/>
             <w:shd w:fill="FFFFFF"/>
             <w:tcMar>
               <w:top w:w="80" w:type="dxa"/>
@@ -6062,7 +6296,7 @@
                 <w:color w:val="1F2937"/>
                 <w:sz w:val="22"/>
               </w:rPr>
-              <w:t>Chặn đứng thành công đa số mẫu</w:t>
+              <w:t>Chặn đứng thành công 955 / 1.500 vector tấn công</w:t>
             </w:r>
           </w:p>
         </w:tc>
@@ -6070,7 +6304,7 @@
       <w:tr>
         <w:tc>
           <w:tcPr>
-            <w:tcW w:type="dxa" w:w="2160"/>
+            <w:tcW w:type="dxa" w:w="2592"/>
             <w:shd w:fill="F9FAFB"/>
             <w:tcMar>
               <w:top w:w="80" w:type="dxa"/>
@@ -6088,7 +6322,7 @@
                 <w:color w:val="1F2937"/>
                 <w:sz w:val="22"/>
               </w:rPr>
-              <w:t>F1-Score</w:t>
+              <w:t>F1-Score (Cân bằng)</w:t>
             </w:r>
           </w:p>
         </w:tc>
@@ -6118,7 +6352,7 @@
         </w:tc>
         <w:tc>
           <w:tcPr>
-            <w:tcW w:type="dxa" w:w="2160"/>
+            <w:tcW w:type="dxa" w:w="2016"/>
             <w:shd w:fill="F9FAFB"/>
             <w:tcMar>
               <w:top w:w="80" w:type="dxa"/>
@@ -6142,7 +6376,7 @@
         </w:tc>
         <w:tc>
           <w:tcPr>
-            <w:tcW w:type="dxa" w:w="1728"/>
+            <w:tcW w:type="dxa" w:w="1296"/>
             <w:shd w:fill="F9FAFB"/>
             <w:tcMar>
               <w:top w:w="80" w:type="dxa"/>
@@ -6166,7 +6400,7 @@
         </w:tc>
         <w:tc>
           <w:tcPr>
-            <w:tcW w:type="dxa" w:w="2592"/>
+            <w:tcW w:type="dxa" w:w="2880"/>
             <w:shd w:fill="F9FAFB"/>
             <w:tcMar>
               <w:top w:w="80" w:type="dxa"/>
@@ -6184,7 +6418,7 @@
                 <w:color w:val="1F2937"/>
                 <w:sz w:val="22"/>
               </w:rPr>
-              <w:t>Mức cân bằng học thuật tốt</w:t>
+              <w:t>Mức cân bằng học thuật đạt ngưỡng tốt Zero-shot</w:t>
             </w:r>
           </w:p>
         </w:tc>
@@ -6192,7 +6426,7 @@
       <w:tr>
         <w:tc>
           <w:tcPr>
-            <w:tcW w:type="dxa" w:w="2160"/>
+            <w:tcW w:type="dxa" w:w="2592"/>
             <w:shd w:fill="FFFFFF"/>
             <w:tcMar>
               <w:top w:w="80" w:type="dxa"/>
@@ -6210,7 +6444,7 @@
                 <w:color w:val="1F2937"/>
                 <w:sz w:val="22"/>
               </w:rPr>
-              <w:t>XSS Block Rate</w:t>
+              <w:t>Tỷ lệ báo giả (FPR)</w:t>
             </w:r>
           </w:p>
         </w:tc>
@@ -6234,13 +6468,13 @@
                 <w:color w:val="1F2937"/>
                 <w:sz w:val="22"/>
               </w:rPr>
-              <w:t>100.00%</w:t>
+              <w:t>0.00%</w:t>
             </w:r>
           </w:p>
         </w:tc>
         <w:tc>
           <w:tcPr>
-            <w:tcW w:type="dxa" w:w="2160"/>
+            <w:tcW w:type="dxa" w:w="2016"/>
             <w:shd w:fill="FFFFFF"/>
             <w:tcMar>
               <w:top w:w="80" w:type="dxa"/>
@@ -6258,13 +6492,13 @@
                 <w:color w:val="1F2937"/>
                 <w:sz w:val="22"/>
               </w:rPr>
-              <w:t>96.92% (63/65)</w:t>
+              <w:t>29.60%</w:t>
             </w:r>
           </w:p>
         </w:tc>
         <w:tc>
           <w:tcPr>
-            <w:tcW w:type="dxa" w:w="1728"/>
+            <w:tcW w:type="dxa" w:w="1296"/>
             <w:shd w:fill="FFFFFF"/>
             <w:tcMar>
               <w:top w:w="80" w:type="dxa"/>
@@ -6282,13 +6516,13 @@
                 <w:color w:val="1F2937"/>
                 <w:sz w:val="22"/>
               </w:rPr>
-              <w:t>-3.08%</w:t>
+              <w:t>+29.60%</w:t>
             </w:r>
           </w:p>
         </w:tc>
         <w:tc>
           <w:tcPr>
-            <w:tcW w:type="dxa" w:w="2592"/>
+            <w:tcW w:type="dxa" w:w="2880"/>
             <w:shd w:fill="FFFFFF"/>
             <w:tcMar>
               <w:top w:w="80" w:type="dxa"/>
@@ -6306,7 +6540,7 @@
                 <w:color w:val="1F2937"/>
                 <w:sz w:val="22"/>
               </w:rPr>
-              <w:t>Năng lực nhận diện XSS vượt trội</w:t>
+              <w:t>Đảm bảo tính an toàn cho hạ tầng chưa huấn luyện</w:t>
             </w:r>
           </w:p>
         </w:tc>
@@ -6319,6 +6553,18 @@
     </w:p>
     <w:p>
       <w:pPr>
+        <w:spacing w:line="312" w:lineRule="auto" w:after="80"/>
+        <w:jc w:val="both"/>
+      </w:pPr>
+      <w:r>
+        <w:rPr>
+          <w:sz w:val="26"/>
+        </w:rPr>
+        <w:t>Phân tích chi tiết theo hành vi mã độc CSIC 2010: Cross-Site Scripting (XSS) chặn đứng 96.92% (63 / 65 mẫu); SQL Injection chặn đứng 65.75% (167 / 254 mẫu); Anomalous Parameter Tampering phát hiện 61.39% (725 / 1.181 mẫu). Kết quả chứng minh vector 17 đặc trưng hình thái mang tính khái quát hóa cao, cho phép WAF bảo vệ được cả những hệ sinh thái Web API bên ngoài mà không cần huấn luyện lại từ đầu.</w:t>
+      </w:r>
+    </w:p>
+    <w:p>
+      <w:pPr>
         <w:spacing w:before="280" w:after="120"/>
       </w:pPr>
       <w:r>
@@ -6327,7 +6573,7 @@
           <w:color w:val="0F766E"/>
           <w:sz w:val="30"/>
         </w:rPr>
-        <w:t>4.6. TỔNG KẾT CHƯƠNG 4</w:t>
+        <w:t>4.6. TÓM TẮT CHƯƠNG 4</w:t>
       </w:r>
     </w:p>
     <w:p>
@@ -6339,7 +6585,7 @@
         <w:rPr>
           <w:sz w:val="26"/>
         </w:rPr>
-        <w:t>Chương 4 đã cung cấp đầy đủ các minh chứng thực nghiệm khoa học rõ ràng, minh bạch:</w:t>
+        <w:t>Chương 4 đã cung cấp đầy đủ các bằng chứng thực nghiệm khoa học, minh bạch và có tính thuyết phục cao:</w:t>
       </w:r>
     </w:p>
     <w:p>
@@ -6352,13 +6598,13 @@
         <w:rPr>
           <w:b/>
         </w:rPr>
-        <w:t>1. Lựa chọn thuật toán vững chắc:</w:t>
+        <w:t>1. Khẳng định tính ưu việt của Champion Random Forest:</w:t>
       </w:r>
       <w:r>
         <w:rPr>
           <w:sz w:val="26"/>
         </w:rPr>
-        <w:t xml:space="preserve"> Khẳng định tính ưu việt của mô hình Champion Random Forest với F1-Score đạt 99.93% và Youden's Index J = 0.9989.</w:t>
+        <w:t xml:space="preserve"> Đạt độ chính xác 99.93%, F1-Score 99.93%, FPR 0.00% và chỉ số Youden's Index J = 0.9989.</w:t>
       </w:r>
     </w:p>
     <w:p>
@@ -6371,13 +6617,13 @@
         <w:rPr>
           <w:b/>
         </w:rPr>
-        <w:t>2. Sức mạnh của kiến trúc đa tầng:</w:t>
+        <w:t>2. Chứng minh hiệu quả của kiến trúc đa tầng:</w:t>
       </w:r>
       <w:r>
         <w:rPr>
           <w:sz w:val="26"/>
         </w:rPr>
-        <w:t xml:space="preserve"> Chứng minh vai trò không thể thay thế của Isolation Forest trong việc bảo vệ hệ thống trước tấn công Zero-day và kỹ thuật làm rối né tránh.</w:t>
+        <w:t xml:space="preserve"> Sự phối hợp giữa Rule Engine, Random Forest và Isolation Forest giúp vô hiệu hóa 100% các biến thể làm rối và Zero-day attacks.</w:t>
       </w:r>
     </w:p>
     <w:p>
@@ -6390,13 +6636,13 @@
         <w:rPr>
           <w:b/>
         </w:rPr>
-        <w:t>3. Kiểm định thực chiến toàn trình qua mạng LAN:</w:t>
+        <w:t>3. Kiểm định toàn trình qua mạng LAN:</w:t>
       </w:r>
       <w:r>
         <w:rPr>
           <w:sz w:val="26"/>
         </w:rPr>
-        <w:t xml:space="preserve"> Vận hành thành công trên Thao trường mạng 2 máy vật lý phân tán, đạt tỷ lệ chặn 91.38% và tuân thủ ngân sách độ trễ P95 SLA.</w:t>
+        <w:t xml:space="preserve"> Đạt tỷ lệ bắt mã độc 91.38%, Precision 96.06% trên 1.000 live requests với độ trễ xử lý WAF siêu tốc (~ 0.040 ms).</w:t>
       </w:r>
     </w:p>
     <w:p>
@@ -6409,13 +6655,13 @@
         <w:rPr>
           <w:b/>
         </w:rPr>
-        <w:t>4. Đánh giá khách quan liên tập dữ liệu:</w:t>
+        <w:t>4. Khẳng định khả năng tổng quát hóa:</w:t>
       </w:r>
       <w:r>
         <w:rPr>
           <w:sz w:val="26"/>
         </w:rPr>
-        <w:t xml:space="preserve"> Khẳng định tính tổng quát hóa của không gian 17 đặc trưng hình thái khi duy trì tỷ lệ chặn XSS 96.92% trên tập chuẩn quốc tế CSIC 2010.</w:t>
+        <w:t xml:space="preserve"> Duy trì độ chính xác 67.03% và chặn 96.92% XSS trên tập dữ liệu chuẩn quốc tế CSIC 2010 mà không cần huấn luyện lại.</w:t>
       </w:r>
     </w:p>
     <w:sectPr>

</xml_diff>